<commit_message>
Use case 3 + Use case diagram
</commit_message>
<xml_diff>
--- a/dokumentace/Specifikace.docx
+++ b/dokumentace/Specifikace.docx
@@ -3,19 +3,22 @@
 <w:document xmlns:wpc="http://schemas.microsoft.com/office/word/2010/wordprocessingCanvas" xmlns:cx="http://schemas.microsoft.com/office/drawing/2014/chartex" xmlns:cx1="http://schemas.microsoft.com/office/drawing/2015/9/8/chartex" xmlns:cx2="http://schemas.microsoft.com/office/drawing/2015/10/21/chartex" xmlns:cx3="http://schemas.microsoft.com/office/drawing/2016/5/9/chartex" xmlns:cx4="http://schemas.microsoft.com/office/drawing/2016/5/10/chartex" xmlns:cx5="http://schemas.microsoft.com/office/drawing/2016/5/11/chartex" xmlns:cx6="http://schemas.microsoft.com/office/drawing/2016/5/12/chartex" xmlns:cx7="http://schemas.microsoft.com/office/drawing/2016/5/13/chartex" xmlns:cx8="http://schemas.microsoft.com/office/drawing/2016/5/14/chartex" xmlns:mc="http://schemas.openxmlformats.org/markup-compatibility/2006" xmlns:aink="http://schemas.microsoft.com/office/drawing/2016/ink" xmlns:am3d="http://schemas.microsoft.com/office/drawing/2017/model3d" xmlns:o="urn:schemas-microsoft-com:office:office" xmlns:oel="http://schemas.microsoft.com/office/2019/extlst" xmlns:r="http://schemas.openxmlformats.org/officeDocument/2006/relationships" xmlns:m="http://schemas.openxmlformats.org/officeDocument/2006/math" xmlns:v="urn:schemas-microsoft-com:vml" xmlns:wp14="http://schemas.microsoft.com/office/word/2010/wordprocessingDrawing" xmlns:wp="http://schemas.openxmlformats.org/drawingml/2006/wordprocessingDrawing" xmlns:w10="urn:schemas-microsoft-com:office:word" xmlns:w="http://schemas.openxmlformats.org/wordprocessingml/2006/main" xmlns:w14="http://schemas.microsoft.com/office/word/2010/wordml" xmlns:w15="http://schemas.microsoft.com/office/word/2012/wordml" xmlns:w16cex="http://schemas.microsoft.com/office/word/2018/wordml/cex" xmlns:w16cid="http://schemas.microsoft.com/office/word/2016/wordml/cid" xmlns:w16="http://schemas.microsoft.com/office/word/2018/wordml" xmlns:w16du="http://schemas.microsoft.com/office/word/2023/wordml/word16du" xmlns:w16sdtdh="http://schemas.microsoft.com/office/word/2020/wordml/sdtdatahash" xmlns:w16sdtfl="http://schemas.microsoft.com/office/word/2024/wordml/sdtformatlock" xmlns:w16se="http://schemas.microsoft.com/office/word/2015/wordml/symex" xmlns:wpg="http://schemas.microsoft.com/office/word/2010/wordprocessingGroup" xmlns:wpi="http://schemas.microsoft.com/office/word/2010/wordprocessingInk" xmlns:wne="http://schemas.microsoft.com/office/word/2006/wordml" xmlns:wps="http://schemas.microsoft.com/office/word/2010/wordprocessingShape" mc:Ignorable="w14 w15 w16se w16cid w16 w16cex w16sdtdh w16sdtfl w16du wp14">
   <w:body>
     <w:p>
+      <w:pPr>
+        <w:pStyle w:val="Heading1"/>
+      </w:pPr>
       <w:r>
         <w:t>Případy užití</w:t>
       </w:r>
     </w:p>
     <w:p>
       <w:r>
-        <w:t xml:space="preserve">Obecná vstupní podmínka: </w:t>
-      </w:r>
-      <w:r>
-        <w:t>Lékař má oprávnění pro přístup a úpravu dat v aplikaci.</w:t>
-      </w:r>
-    </w:p>
-    <w:p>
+        <w:t>Obecná vstupní podmínka: Lékař má oprávnění pro přístup a úpravu dat v aplikaci.</w:t>
+      </w:r>
+    </w:p>
+    <w:p>
+      <w:pPr>
+        <w:pStyle w:val="Heading2"/>
+      </w:pPr>
       <w:r>
         <w:t>Id: PU-01</w:t>
       </w:r>
@@ -53,19 +56,7 @@
         </w:numPr>
       </w:pPr>
       <w:r>
-        <w:t>V seznamu pacientů zvolí</w:t>
-      </w:r>
-      <w:r>
-        <w:t xml:space="preserve"> a stiskne</w:t>
-      </w:r>
-      <w:r>
-        <w:t xml:space="preserve"> lékař </w:t>
-      </w:r>
-      <w:r>
-        <w:t xml:space="preserve">tlačítko </w:t>
-      </w:r>
-      <w:r>
-        <w:t>„Přidat pacienta“</w:t>
+        <w:t>V seznamu pacientů zvolí a stiskne lékař tlačítko „Přidat pacienta“</w:t>
       </w:r>
       <w:r>
         <w:t>.</w:t>
@@ -238,6 +229,9 @@
     </w:p>
     <w:p/>
     <w:p>
+      <w:pPr>
+        <w:pStyle w:val="Heading2"/>
+      </w:pPr>
       <w:r>
         <w:t>Id: PU-0</w:t>
       </w:r>
@@ -328,48 +322,273 @@
     </w:p>
     <w:p>
       <w:r>
+        <w:lastRenderedPageBreak/>
         <w:t>Vstupní podmínky:</w:t>
       </w:r>
     </w:p>
     <w:p>
       <w:r>
+        <w:t xml:space="preserve">Výstupní podmínky: </w:t>
+      </w:r>
+      <w:r>
+        <w:t>Je zobrazen seznam pouze aktivních neschopenek</w:t>
+      </w:r>
+      <w:r>
+        <w:t>.</w:t>
+      </w:r>
+    </w:p>
+    <w:p/>
+    <w:p>
+      <w:pPr>
+        <w:pStyle w:val="Heading2"/>
+      </w:pPr>
+      <w:r>
+        <w:t>Id: PU-0</w:t>
+      </w:r>
+      <w:r>
+        <w:t>3</w:t>
+      </w:r>
+    </w:p>
+    <w:p>
+      <w:r>
+        <w:t xml:space="preserve">Název: </w:t>
+      </w:r>
+      <w:r>
+        <w:t>Vyh</w:t>
+      </w:r>
+      <w:r>
+        <w:t>l</w:t>
+      </w:r>
+      <w:r>
+        <w:t>edat pacienta</w:t>
+      </w:r>
+    </w:p>
+    <w:p>
+      <w:r>
+        <w:t xml:space="preserve">Stručný popis: </w:t>
+      </w:r>
+      <w:r>
+        <w:t>Aplikace umožní lékaři vyhledat v kartotéce pacienta a zobrazit si jeho údaje.</w:t>
+      </w:r>
+    </w:p>
+    <w:p>
+      <w:r>
+        <w:t>Hlavní scénář:</w:t>
+      </w:r>
+      <w:r>
+        <w:t xml:space="preserve"> </w:t>
+      </w:r>
+    </w:p>
+    <w:p>
+      <w:pPr>
+        <w:pStyle w:val="ListParagraph"/>
+        <w:numPr>
+          <w:ilvl w:val="0"/>
+          <w:numId w:val="9"/>
+        </w:numPr>
+      </w:pPr>
+      <w:r>
+        <w:t>Vybere ve vyhledávači položku, podle které chce vyhledávat (jméno, rodné číslo, číslo pojišťovny) a zadá do vyhledávače hledaný výraz.</w:t>
+      </w:r>
+    </w:p>
+    <w:p>
+      <w:pPr>
+        <w:pStyle w:val="ListParagraph"/>
+        <w:numPr>
+          <w:ilvl w:val="0"/>
+          <w:numId w:val="9"/>
+        </w:numPr>
+      </w:pPr>
+      <w:r>
+        <w:t>Aplikace zobrazí seznam pacientů vyhovujících vyhledávací podmínce.</w:t>
+      </w:r>
+    </w:p>
+    <w:p>
+      <w:pPr>
+        <w:pStyle w:val="ListParagraph"/>
+        <w:numPr>
+          <w:ilvl w:val="0"/>
+          <w:numId w:val="9"/>
+        </w:numPr>
+      </w:pPr>
+      <w:r>
+        <w:t>Lékař zvolí hledaného pacienta.</w:t>
+      </w:r>
+    </w:p>
+    <w:p>
+      <w:pPr>
+        <w:pStyle w:val="ListParagraph"/>
+        <w:numPr>
+          <w:ilvl w:val="0"/>
+          <w:numId w:val="9"/>
+        </w:numPr>
+      </w:pPr>
+      <w:r>
+        <w:t>Aplikace zobrazí detail pacienta se všemi osobními údaji (jméno, příjmení, číslo pojištěnce/rodné číslo, datum narození, číslo pojišťovny, bydliště), pacientovými diagnózami a předepsanými léčivy.</w:t>
+      </w:r>
+    </w:p>
+    <w:p>
+      <w:pPr>
+        <w:pStyle w:val="ListParagraph"/>
+        <w:numPr>
+          <w:ilvl w:val="0"/>
+          <w:numId w:val="9"/>
+        </w:numPr>
+      </w:pPr>
+      <w:r>
+        <w:t>Lékař zvolí „Zavřít“.</w:t>
+      </w:r>
+    </w:p>
+    <w:p>
+      <w:pPr>
+        <w:pStyle w:val="ListParagraph"/>
+        <w:numPr>
+          <w:ilvl w:val="0"/>
+          <w:numId w:val="9"/>
+        </w:numPr>
+      </w:pPr>
+      <w:r>
+        <w:t>Aplikace se vrátí na seznam pacientů.</w:t>
+      </w:r>
+    </w:p>
+    <w:p>
+      <w:r>
+        <w:t>Alternativní scénář</w:t>
+      </w:r>
+      <w:r>
+        <w:t>e</w:t>
+      </w:r>
+      <w:r>
+        <w:t>:</w:t>
+      </w:r>
+    </w:p>
+    <w:p>
+      <w:pPr>
+        <w:numPr>
+          <w:ilvl w:val="0"/>
+          <w:numId w:val="10"/>
+        </w:numPr>
+      </w:pPr>
+      <w:r>
+        <w:t xml:space="preserve">V kroku </w:t>
+      </w:r>
+      <w:r>
+        <w:t>2</w:t>
+      </w:r>
+      <w:r>
+        <w:t xml:space="preserve">: </w:t>
+      </w:r>
+      <w:r>
+        <w:t>P</w:t>
+      </w:r>
+      <w:r>
+        <w:t xml:space="preserve">okud </w:t>
+      </w:r>
+      <w:r>
+        <w:t>není hledaný pacient nalezen:</w:t>
+      </w:r>
+    </w:p>
+    <w:p>
+      <w:pPr>
+        <w:pStyle w:val="ListParagraph"/>
+        <w:numPr>
+          <w:ilvl w:val="1"/>
+          <w:numId w:val="10"/>
+        </w:numPr>
+      </w:pPr>
+      <w:r>
+        <w:t>Aplikace zobrazí prázdný seznam a vypíše</w:t>
+      </w:r>
+      <w:r>
+        <w:t xml:space="preserve"> hlíšku.</w:t>
+      </w:r>
+    </w:p>
+    <w:p>
+      <w:pPr>
+        <w:numPr>
+          <w:ilvl w:val="1"/>
+          <w:numId w:val="10"/>
+        </w:numPr>
+      </w:pPr>
+      <w:r>
+        <w:t>Lékař vyhledá pacienta podle jiného kritéria, pokračuje krok 2.</w:t>
+      </w:r>
+    </w:p>
+    <w:p>
+      <w:r>
+        <w:t>Vstupní podmínky: Lékař má zobrazen seznam pacientů v sekci „Pacienti“.</w:t>
+      </w:r>
+    </w:p>
+    <w:p>
+      <w:r>
+        <w:t>Výstupní podmínky:</w:t>
+      </w:r>
+    </w:p>
+    <w:p/>
+    <w:p>
+      <w:pPr>
+        <w:pStyle w:val="Heading2"/>
+      </w:pPr>
+      <w:r>
+        <w:t>Id: PU-0</w:t>
+      </w:r>
+      <w:r>
+        <w:t>4</w:t>
+      </w:r>
+    </w:p>
+    <w:p>
+      <w:r>
+        <w:t xml:space="preserve">Název: </w:t>
+      </w:r>
+      <w:r>
+        <w:t>Předepsat léčivo</w:t>
+      </w:r>
+    </w:p>
+    <w:p>
+      <w:r>
+        <w:t xml:space="preserve">Stručný popis: </w:t>
+      </w:r>
+      <w:r>
+        <w:t>Aplikace umožní lékaři zkontrolovat pacientova předepsaná léčiva a předepsat další.</w:t>
+      </w:r>
+    </w:p>
+    <w:p>
+      <w:r>
+        <w:t xml:space="preserve">Hlavní scénář: </w:t>
+      </w:r>
+    </w:p>
+    <w:p>
+      <w:pPr>
+        <w:numPr>
+          <w:ilvl w:val="0"/>
+          <w:numId w:val="4"/>
+        </w:numPr>
+      </w:pPr>
+      <w:r>
+        <w:t>Vyhledat pacienta (PU-03) kroky 1-4.</w:t>
+      </w:r>
+    </w:p>
+    <w:p>
+      <w:pPr>
+        <w:numPr>
+          <w:ilvl w:val="0"/>
+          <w:numId w:val="4"/>
+        </w:numPr>
+      </w:pPr>
+      <w:r>
+        <w:t>Lékař stiskne tlačítko „Přidat předpis“.</w:t>
+      </w:r>
+    </w:p>
+    <w:p>
+      <w:pPr>
+        <w:numPr>
+          <w:ilvl w:val="0"/>
+          <w:numId w:val="4"/>
+        </w:numPr>
+      </w:pPr>
+      <w:r>
         <w:lastRenderedPageBreak/>
-        <w:t xml:space="preserve">Výstupní podmínky: </w:t>
-      </w:r>
-      <w:r>
-        <w:t>Je zobrazen seznam pouze aktivních neschopenek</w:t>
-      </w:r>
-      <w:r>
-        <w:t>.</w:t>
-      </w:r>
-    </w:p>
-    <w:p>
-      <w:r>
-        <w:t>Id: PU-0</w:t>
-      </w:r>
-      <w:r>
-        <w:t>3</w:t>
-      </w:r>
-    </w:p>
-    <w:p>
-      <w:r>
-        <w:t xml:space="preserve">Název: </w:t>
-      </w:r>
-      <w:r>
-        <w:t>Předepsat léčivo</w:t>
-      </w:r>
-    </w:p>
-    <w:p>
-      <w:r>
-        <w:t xml:space="preserve">Stručný popis: </w:t>
-      </w:r>
-      <w:r>
-        <w:t>Aplikace umožní lékaři zkontrolovat pacientova předepsaná léčiva a předepsat další.</w:t>
-      </w:r>
-    </w:p>
-    <w:p>
-      <w:r>
-        <w:t xml:space="preserve">Hlavní scénář: </w:t>
+        <w:t>Aplikace zobrazí formulář pro předpis léčiva.</w:t>
       </w:r>
     </w:p>
     <w:p>
@@ -380,7 +599,7 @@
         </w:numPr>
       </w:pPr>
       <w:r>
-        <w:t>Lékař vyhledá v seznamu pacientů konkrétního pacienta podle rodného čísla, či jména.</w:t>
+        <w:t>Lékař vybere léčivo ze seznamu a vyplní stručný komentář týkající se užívání. Stiskne tlačítko „Uložit“.</w:t>
       </w:r>
     </w:p>
     <w:p>
@@ -391,10 +610,7 @@
         </w:numPr>
       </w:pPr>
       <w:r>
-        <w:t>Systém zobrazí seznam pacientů vyhovujících vyhledávací podmínce</w:t>
-      </w:r>
-      <w:r>
-        <w:t>.</w:t>
+        <w:t>Systém uloží záznam o předpisu s aktuálním datem a zobrazí zpět detail pacienta.</w:t>
       </w:r>
     </w:p>
     <w:p>
@@ -405,72 +621,6 @@
         </w:numPr>
       </w:pPr>
       <w:r>
-        <w:t>Lékař zvolí hledaného pacienta.</w:t>
-      </w:r>
-    </w:p>
-    <w:p>
-      <w:pPr>
-        <w:numPr>
-          <w:ilvl w:val="0"/>
-          <w:numId w:val="4"/>
-        </w:numPr>
-      </w:pPr>
-      <w:r>
-        <w:t>Aplikace zobrazí detail pacienta s jeho osobními údaji, seznamem diagnóz a seznamem předepsaných léčiv.</w:t>
-      </w:r>
-    </w:p>
-    <w:p>
-      <w:pPr>
-        <w:numPr>
-          <w:ilvl w:val="0"/>
-          <w:numId w:val="4"/>
-        </w:numPr>
-      </w:pPr>
-      <w:r>
-        <w:t>Lékař stiskne tlačítko „Přidat předpis“.</w:t>
-      </w:r>
-    </w:p>
-    <w:p>
-      <w:pPr>
-        <w:numPr>
-          <w:ilvl w:val="0"/>
-          <w:numId w:val="4"/>
-        </w:numPr>
-      </w:pPr>
-      <w:r>
-        <w:t>Aplikace zobrazí formulář pro předpis léčiva.</w:t>
-      </w:r>
-    </w:p>
-    <w:p>
-      <w:pPr>
-        <w:numPr>
-          <w:ilvl w:val="0"/>
-          <w:numId w:val="4"/>
-        </w:numPr>
-      </w:pPr>
-      <w:r>
-        <w:t>Lékař vybere léčivo ze seznamu a vyplní stručný komentář týkající se užívání. Stiskne tlačítko „Uložit“.</w:t>
-      </w:r>
-    </w:p>
-    <w:p>
-      <w:pPr>
-        <w:numPr>
-          <w:ilvl w:val="0"/>
-          <w:numId w:val="4"/>
-        </w:numPr>
-      </w:pPr>
-      <w:r>
-        <w:t>Systém uloží záznam o předpisu s aktuálním datem a zobrazí zpět detail pacienta.</w:t>
-      </w:r>
-    </w:p>
-    <w:p>
-      <w:pPr>
-        <w:numPr>
-          <w:ilvl w:val="0"/>
-          <w:numId w:val="4"/>
-        </w:numPr>
-      </w:pPr>
-      <w:r>
         <w:t>Nový předpis se zobrazí na začátku seznamu předepsaných léčiv.</w:t>
       </w:r>
     </w:p>
@@ -487,22 +637,7 @@
         </w:numPr>
       </w:pPr>
       <w:r>
-        <w:t xml:space="preserve">V kroku </w:t>
-      </w:r>
-      <w:r>
-        <w:t>3</w:t>
-      </w:r>
-      <w:r>
-        <w:t xml:space="preserve">: </w:t>
-      </w:r>
-      <w:r>
-        <w:t>P</w:t>
-      </w:r>
-      <w:r>
-        <w:t xml:space="preserve">okud </w:t>
-      </w:r>
-      <w:r>
-        <w:t>není hledaný pacient nalezen:</w:t>
+        <w:t>V kroku 8: Pokud jsou některé údaje vyplněny v chybném formátu:</w:t>
       </w:r>
     </w:p>
     <w:p>
@@ -511,39 +646,23 @@
           <w:ilvl w:val="1"/>
           <w:numId w:val="5"/>
         </w:numPr>
-        <w:ind w:left="1276" w:hanging="425"/>
-      </w:pPr>
-      <w:r>
-        <w:t>Lékař vyhledá pacienta podle jiného kritéria, pokračuje krok 2.</w:t>
-      </w:r>
-    </w:p>
-    <w:p>
-      <w:pPr>
-        <w:numPr>
-          <w:ilvl w:val="0"/>
-          <w:numId w:val="5"/>
-        </w:numPr>
-      </w:pPr>
-      <w:r>
-        <w:t xml:space="preserve">V kroku 8: Pokud </w:t>
-      </w:r>
-      <w:r>
-        <w:t>jsou některé údaje vyplněny v chybném formátu</w:t>
-      </w:r>
-      <w:r>
-        <w:t>:</w:t>
-      </w:r>
-    </w:p>
-    <w:p>
-      <w:pPr>
+        <w:ind w:left="1276" w:hanging="436"/>
+      </w:pPr>
+      <w:r>
+        <w:t>Systém neuloží předpis do databáze.</w:t>
+      </w:r>
+    </w:p>
+    <w:p>
+      <w:pPr>
+        <w:pStyle w:val="ListParagraph"/>
         <w:numPr>
           <w:ilvl w:val="1"/>
           <w:numId w:val="5"/>
         </w:numPr>
-        <w:ind w:left="1276" w:hanging="436"/>
-      </w:pPr>
-      <w:r>
-        <w:t>Systém neuloží předpis do databáze.</w:t>
+        <w:ind w:left="1276" w:hanging="426"/>
+      </w:pPr>
+      <w:r>
+        <w:t>Systém vypíše varovnou hlášku.</w:t>
       </w:r>
     </w:p>
     <w:p>
@@ -553,29 +672,10 @@
           <w:ilvl w:val="1"/>
           <w:numId w:val="5"/>
         </w:numPr>
-        <w:ind w:left="1276" w:hanging="426"/>
-      </w:pPr>
-      <w:r>
-        <w:t>Systém vypíše varovnou hlášku.</w:t>
-      </w:r>
-    </w:p>
-    <w:p>
-      <w:pPr>
-        <w:pStyle w:val="ListParagraph"/>
-        <w:numPr>
-          <w:ilvl w:val="1"/>
-          <w:numId w:val="5"/>
-        </w:numPr>
         <w:ind w:left="1276" w:hanging="425"/>
       </w:pPr>
       <w:r>
-        <w:t>Lékaři se zobrazí formulář s dosud vyplněnými údaji a červeně označenými chybně vyplněnými poli</w:t>
-      </w:r>
-      <w:r>
-        <w:t>, pokračuje krok 7</w:t>
-      </w:r>
-      <w:r>
-        <w:t>.</w:t>
+        <w:t>Lékaři se zobrazí formulář s dosud vyplněnými údaji a červeně označenými chybně vyplněnými poli, pokračuje krok 7.</w:t>
       </w:r>
     </w:p>
     <w:p>
@@ -594,160 +694,170 @@
         <w:t>Nový předpis je uložen do databáze a seznamu předepsaných léčiv daného pacienta.</w:t>
       </w:r>
     </w:p>
-    <w:p>
+    <w:p/>
+    <w:p>
+      <w:pPr>
+        <w:pStyle w:val="Heading2"/>
+      </w:pPr>
+      <w:r>
+        <w:t>Id: PU-0</w:t>
+      </w:r>
+      <w:r>
+        <w:t>5</w:t>
+      </w:r>
+    </w:p>
+    <w:p>
+      <w:r>
+        <w:t xml:space="preserve">Název: </w:t>
+      </w:r>
+      <w:r>
+        <w:t>Př</w:t>
+      </w:r>
+      <w:r>
+        <w:t>idat diagnózu</w:t>
+      </w:r>
+    </w:p>
+    <w:p>
+      <w:r>
+        <w:t xml:space="preserve">Stručný popis: </w:t>
+      </w:r>
+      <w:r>
+        <w:t>Aplikace umožní lékaři zkontrolovat pacientov</w:t>
+      </w:r>
+      <w:r>
+        <w:t>y diagnózy a přidat novou.</w:t>
+      </w:r>
+    </w:p>
+    <w:p>
+      <w:r>
+        <w:t xml:space="preserve">Hlavní scénář: </w:t>
+      </w:r>
+    </w:p>
+    <w:p>
+      <w:pPr>
+        <w:pStyle w:val="ListParagraph"/>
+        <w:numPr>
+          <w:ilvl w:val="0"/>
+          <w:numId w:val="6"/>
+        </w:numPr>
+      </w:pPr>
+      <w:r>
+        <w:t>Lékař se na stránce přesune k seznamu pacientových diagnóz a zvolí „Přidat diagnózu“.</w:t>
+      </w:r>
+    </w:p>
+    <w:p>
+      <w:pPr>
+        <w:pStyle w:val="ListParagraph"/>
+        <w:numPr>
+          <w:ilvl w:val="0"/>
+          <w:numId w:val="6"/>
+        </w:numPr>
+      </w:pPr>
+      <w:r>
+        <w:t>Systém zobrazí formulář pro přidání diagnózy.</w:t>
+      </w:r>
+    </w:p>
+    <w:p>
+      <w:pPr>
+        <w:pStyle w:val="ListParagraph"/>
+        <w:numPr>
+          <w:ilvl w:val="0"/>
+          <w:numId w:val="6"/>
+        </w:numPr>
+      </w:pPr>
+      <w:r>
+        <w:t>Lékař vybere diagnózu ze seznamu</w:t>
+      </w:r>
+      <w:r>
+        <w:t xml:space="preserve">, </w:t>
+      </w:r>
+      <w:r>
+        <w:t xml:space="preserve">vyplní </w:t>
+      </w:r>
+      <w:r>
+        <w:t>popis pacientova stavu a zvolí „Uložit“.</w:t>
+      </w:r>
+    </w:p>
+    <w:p>
+      <w:pPr>
+        <w:pStyle w:val="ListParagraph"/>
+        <w:numPr>
+          <w:ilvl w:val="0"/>
+          <w:numId w:val="6"/>
+        </w:numPr>
+      </w:pPr>
+      <w:r>
+        <w:t>Systém uloží záznam o diagnóze s aktuálním datem a zobrazí detail pacienta.</w:t>
+      </w:r>
+    </w:p>
+    <w:p>
+      <w:pPr>
+        <w:pStyle w:val="ListParagraph"/>
+        <w:numPr>
+          <w:ilvl w:val="0"/>
+          <w:numId w:val="6"/>
+        </w:numPr>
+      </w:pPr>
+      <w:r>
+        <w:t>Na začátku seznamu pacientových diagnóz se objeví nová diagnóza.</w:t>
+      </w:r>
+    </w:p>
+    <w:p>
+      <w:r>
+        <w:t>Alternativní scénáře:</w:t>
+      </w:r>
+    </w:p>
+    <w:p>
+      <w:r>
+        <w:t>Vstupní podmínky:</w:t>
+      </w:r>
+      <w:r>
+        <w:t xml:space="preserve"> </w:t>
+      </w:r>
+      <w:r>
+        <w:t>Lékař má zobrazený detail konkrétního pacienta.</w:t>
+      </w:r>
+      <w:r>
+        <w:t xml:space="preserve"> (přístup skrz Vyhledat pacienta (kroky 1-4)/výběr z celého seznamu)</w:t>
+      </w:r>
+    </w:p>
+    <w:p>
+      <w:r>
+        <w:t xml:space="preserve">Výstupní podmínky: </w:t>
+      </w:r>
+      <w:r>
+        <w:t>Nov</w:t>
+      </w:r>
+      <w:r>
+        <w:t>á diagnóza</w:t>
+      </w:r>
+      <w:r>
+        <w:t xml:space="preserve"> je uložen</w:t>
+      </w:r>
+      <w:r>
+        <w:t>a</w:t>
+      </w:r>
+      <w:r>
+        <w:t xml:space="preserve"> do databáze a seznamu </w:t>
+      </w:r>
+      <w:r>
+        <w:t xml:space="preserve">diagnóz </w:t>
+      </w:r>
+      <w:r>
+        <w:t>daného pacienta.</w:t>
+      </w:r>
+    </w:p>
+    <w:p/>
+    <w:p>
+      <w:pPr>
+        <w:pStyle w:val="Heading2"/>
+      </w:pPr>
       <w:r>
         <w:lastRenderedPageBreak/>
         <w:t>Id: PU-0</w:t>
       </w:r>
       <w:r>
-        <w:t>4</w:t>
-      </w:r>
-    </w:p>
-    <w:p>
-      <w:r>
-        <w:t xml:space="preserve">Název: </w:t>
-      </w:r>
-      <w:r>
-        <w:t>Př</w:t>
-      </w:r>
-      <w:r>
-        <w:t>idat diagnózu</w:t>
-      </w:r>
-    </w:p>
-    <w:p>
-      <w:r>
-        <w:t xml:space="preserve">Stručný popis: </w:t>
-      </w:r>
-      <w:r>
-        <w:t>Aplikace umožní lékaři zkontrolovat pacientov</w:t>
-      </w:r>
-      <w:r>
-        <w:t>y diagnózy a přidat novou.</w:t>
-      </w:r>
-    </w:p>
-    <w:p>
-      <w:r>
-        <w:t xml:space="preserve">Hlavní scénář: </w:t>
-      </w:r>
-    </w:p>
-    <w:p>
-      <w:pPr>
-        <w:pStyle w:val="ListParagraph"/>
-        <w:numPr>
-          <w:ilvl w:val="0"/>
-          <w:numId w:val="6"/>
-        </w:numPr>
-      </w:pPr>
-      <w:r>
-        <w:t>Lékař se na stránce přesune k seznamu pacientových diagnóz a zvolí „Přidat diagnózu“.</w:t>
-      </w:r>
-    </w:p>
-    <w:p>
-      <w:pPr>
-        <w:pStyle w:val="ListParagraph"/>
-        <w:numPr>
-          <w:ilvl w:val="0"/>
-          <w:numId w:val="6"/>
-        </w:numPr>
-      </w:pPr>
-      <w:r>
-        <w:t>Systém zobrazí formulář pro přidání diagnózy.</w:t>
-      </w:r>
-    </w:p>
-    <w:p>
-      <w:pPr>
-        <w:pStyle w:val="ListParagraph"/>
-        <w:numPr>
-          <w:ilvl w:val="0"/>
-          <w:numId w:val="6"/>
-        </w:numPr>
-      </w:pPr>
-      <w:r>
-        <w:t>Lékař vybere diagnózu ze seznamu</w:t>
-      </w:r>
-      <w:r>
-        <w:t xml:space="preserve">, </w:t>
-      </w:r>
-      <w:r>
-        <w:t xml:space="preserve">vyplní </w:t>
-      </w:r>
-      <w:r>
-        <w:t>popis pacientova stavu a zvolí „Uložit“.</w:t>
-      </w:r>
-    </w:p>
-    <w:p>
-      <w:pPr>
-        <w:pStyle w:val="ListParagraph"/>
-        <w:numPr>
-          <w:ilvl w:val="0"/>
-          <w:numId w:val="6"/>
-        </w:numPr>
-      </w:pPr>
-      <w:r>
-        <w:t>Systém uloží záznam o diagnóze s aktuálním datem a zobrazí detail pacienta.</w:t>
-      </w:r>
-    </w:p>
-    <w:p>
-      <w:pPr>
-        <w:pStyle w:val="ListParagraph"/>
-        <w:numPr>
-          <w:ilvl w:val="0"/>
-          <w:numId w:val="6"/>
-        </w:numPr>
-      </w:pPr>
-      <w:r>
-        <w:t>Na začátku seznamu pacientových diagnóz se objeví nová diagnóza.</w:t>
-      </w:r>
-    </w:p>
-    <w:p>
-      <w:r>
-        <w:t>Alternativní scénáře:</w:t>
-      </w:r>
-    </w:p>
-    <w:p>
-      <w:r>
-        <w:t>Vstupní podmínky:</w:t>
-      </w:r>
-      <w:r>
-        <w:t xml:space="preserve"> </w:t>
-      </w:r>
-      <w:r>
-        <w:t>Lékař má zobrazený detail konkrétního pacienta.</w:t>
-      </w:r>
-    </w:p>
-    <w:p>
-      <w:r>
-        <w:t xml:space="preserve">Výstupní podmínky: </w:t>
-      </w:r>
-      <w:r>
-        <w:t>Nov</w:t>
-      </w:r>
-      <w:r>
-        <w:t>á diagnóza</w:t>
-      </w:r>
-      <w:r>
-        <w:t xml:space="preserve"> je uložen</w:t>
-      </w:r>
-      <w:r>
-        <w:t>a</w:t>
-      </w:r>
-      <w:r>
-        <w:t xml:space="preserve"> do databáze a seznamu </w:t>
-      </w:r>
-      <w:r>
-        <w:t xml:space="preserve">diagnóz </w:t>
-      </w:r>
-      <w:r>
-        <w:t>daného pacienta.</w:t>
-      </w:r>
-    </w:p>
-    <w:p/>
-    <w:p>
-      <w:r>
-        <w:t>Id: PU-0</w:t>
-      </w:r>
-      <w:r>
-        <w:t>5</w:t>
+        <w:t>6</w:t>
       </w:r>
     </w:p>
     <w:p>
@@ -868,6 +978,95 @@
 <file path=word/numbering.xml><?xml version="1.0" encoding="utf-8"?>
 <w:numbering xmlns:wpc="http://schemas.microsoft.com/office/word/2010/wordprocessingCanvas" xmlns:cx="http://schemas.microsoft.com/office/drawing/2014/chartex" xmlns:cx1="http://schemas.microsoft.com/office/drawing/2015/9/8/chartex" xmlns:cx2="http://schemas.microsoft.com/office/drawing/2015/10/21/chartex" xmlns:cx3="http://schemas.microsoft.com/office/drawing/2016/5/9/chartex" xmlns:cx4="http://schemas.microsoft.com/office/drawing/2016/5/10/chartex" xmlns:cx5="http://schemas.microsoft.com/office/drawing/2016/5/11/chartex" xmlns:cx6="http://schemas.microsoft.com/office/drawing/2016/5/12/chartex" xmlns:cx7="http://schemas.microsoft.com/office/drawing/2016/5/13/chartex" xmlns:cx8="http://schemas.microsoft.com/office/drawing/2016/5/14/chartex" xmlns:mc="http://schemas.openxmlformats.org/markup-compatibility/2006" xmlns:aink="http://schemas.microsoft.com/office/drawing/2016/ink" xmlns:am3d="http://schemas.microsoft.com/office/drawing/2017/model3d" xmlns:o="urn:schemas-microsoft-com:office:office" xmlns:oel="http://schemas.microsoft.com/office/2019/extlst" xmlns:r="http://schemas.openxmlformats.org/officeDocument/2006/relationships" xmlns:m="http://schemas.openxmlformats.org/officeDocument/2006/math" xmlns:v="urn:schemas-microsoft-com:vml" xmlns:wp14="http://schemas.microsoft.com/office/word/2010/wordprocessingDrawing" xmlns:wp="http://schemas.openxmlformats.org/drawingml/2006/wordprocessingDrawing" xmlns:w10="urn:schemas-microsoft-com:office:word" xmlns:w="http://schemas.openxmlformats.org/wordprocessingml/2006/main" xmlns:w14="http://schemas.microsoft.com/office/word/2010/wordml" xmlns:w15="http://schemas.microsoft.com/office/word/2012/wordml" xmlns:w16cex="http://schemas.microsoft.com/office/word/2018/wordml/cex" xmlns:w16cid="http://schemas.microsoft.com/office/word/2016/wordml/cid" xmlns:w16="http://schemas.microsoft.com/office/word/2018/wordml" xmlns:w16du="http://schemas.microsoft.com/office/word/2023/wordml/word16du" xmlns:w16sdtdh="http://schemas.microsoft.com/office/word/2020/wordml/sdtdatahash" xmlns:w16sdtfl="http://schemas.microsoft.com/office/word/2024/wordml/sdtformatlock" xmlns:w16se="http://schemas.microsoft.com/office/word/2015/wordml/symex" xmlns:wpg="http://schemas.microsoft.com/office/word/2010/wordprocessingGroup" xmlns:wpi="http://schemas.microsoft.com/office/word/2010/wordprocessingInk" xmlns:wne="http://schemas.microsoft.com/office/word/2006/wordml" xmlns:wps="http://schemas.microsoft.com/office/word/2010/wordprocessingShape" mc:Ignorable="w14 w15 w16se w16cid w16 w16cex w16sdtdh w16sdtfl w16du wp14">
   <w:abstractNum w:abstractNumId="0" w15:restartNumberingAfterBreak="0">
+    <w:nsid w:val="1E682629"/>
+    <w:multiLevelType w:val="hybridMultilevel"/>
+    <w:tmpl w:val="E990D220"/>
+    <w:lvl w:ilvl="0" w:tplc="08090019">
+      <w:start w:val="1"/>
+      <w:numFmt w:val="lowerLetter"/>
+      <w:lvlText w:val="%1."/>
+      <w:lvlJc w:val="left"/>
+      <w:pPr>
+        <w:ind w:left="720" w:hanging="360"/>
+      </w:pPr>
+    </w:lvl>
+    <w:lvl w:ilvl="1" w:tplc="1A3E197E">
+      <w:start w:val="1"/>
+      <w:numFmt w:val="decimal"/>
+      <w:lvlText w:val="%2."/>
+      <w:lvlJc w:val="left"/>
+      <w:pPr>
+        <w:ind w:left="1440" w:hanging="360"/>
+      </w:pPr>
+      <w:rPr>
+        <w:rFonts w:hint="default"/>
+      </w:rPr>
+    </w:lvl>
+    <w:lvl w:ilvl="2" w:tplc="0809001B" w:tentative="1">
+      <w:start w:val="1"/>
+      <w:numFmt w:val="lowerRoman"/>
+      <w:lvlText w:val="%3."/>
+      <w:lvlJc w:val="right"/>
+      <w:pPr>
+        <w:ind w:left="2160" w:hanging="180"/>
+      </w:pPr>
+    </w:lvl>
+    <w:lvl w:ilvl="3" w:tplc="0809000F">
+      <w:start w:val="1"/>
+      <w:numFmt w:val="decimal"/>
+      <w:lvlText w:val="%4."/>
+      <w:lvlJc w:val="left"/>
+      <w:pPr>
+        <w:ind w:left="2880" w:hanging="360"/>
+      </w:pPr>
+    </w:lvl>
+    <w:lvl w:ilvl="4" w:tplc="08090019" w:tentative="1">
+      <w:start w:val="1"/>
+      <w:numFmt w:val="lowerLetter"/>
+      <w:lvlText w:val="%5."/>
+      <w:lvlJc w:val="left"/>
+      <w:pPr>
+        <w:ind w:left="3600" w:hanging="360"/>
+      </w:pPr>
+    </w:lvl>
+    <w:lvl w:ilvl="5" w:tplc="0809001B" w:tentative="1">
+      <w:start w:val="1"/>
+      <w:numFmt w:val="lowerRoman"/>
+      <w:lvlText w:val="%6."/>
+      <w:lvlJc w:val="right"/>
+      <w:pPr>
+        <w:ind w:left="4320" w:hanging="180"/>
+      </w:pPr>
+    </w:lvl>
+    <w:lvl w:ilvl="6" w:tplc="0809000F" w:tentative="1">
+      <w:start w:val="1"/>
+      <w:numFmt w:val="decimal"/>
+      <w:lvlText w:val="%7."/>
+      <w:lvlJc w:val="left"/>
+      <w:pPr>
+        <w:ind w:left="5040" w:hanging="360"/>
+      </w:pPr>
+    </w:lvl>
+    <w:lvl w:ilvl="7" w:tplc="08090019" w:tentative="1">
+      <w:start w:val="1"/>
+      <w:numFmt w:val="lowerLetter"/>
+      <w:lvlText w:val="%8."/>
+      <w:lvlJc w:val="left"/>
+      <w:pPr>
+        <w:ind w:left="5760" w:hanging="360"/>
+      </w:pPr>
+    </w:lvl>
+    <w:lvl w:ilvl="8" w:tplc="0809001B" w:tentative="1">
+      <w:start w:val="1"/>
+      <w:numFmt w:val="lowerRoman"/>
+      <w:lvlText w:val="%9."/>
+      <w:lvlJc w:val="right"/>
+      <w:pPr>
+        <w:ind w:left="6480" w:hanging="180"/>
+      </w:pPr>
+    </w:lvl>
+  </w:abstractNum>
+  <w:abstractNum w:abstractNumId="1" w15:restartNumberingAfterBreak="0">
     <w:nsid w:val="1F4D11CC"/>
     <w:multiLevelType w:val="hybridMultilevel"/>
     <w:tmpl w:val="484E4436"/>
@@ -953,7 +1152,7 @@
       </w:pPr>
     </w:lvl>
   </w:abstractNum>
-  <w:abstractNum w:abstractNumId="1" w15:restartNumberingAfterBreak="0">
+  <w:abstractNum w:abstractNumId="2" w15:restartNumberingAfterBreak="0">
     <w:nsid w:val="22B828E5"/>
     <w:multiLevelType w:val="hybridMultilevel"/>
     <w:tmpl w:val="20B06724"/>
@@ -1039,7 +1238,7 @@
       </w:pPr>
     </w:lvl>
   </w:abstractNum>
-  <w:abstractNum w:abstractNumId="2" w15:restartNumberingAfterBreak="0">
+  <w:abstractNum w:abstractNumId="3" w15:restartNumberingAfterBreak="0">
     <w:nsid w:val="24976F61"/>
     <w:multiLevelType w:val="hybridMultilevel"/>
     <w:tmpl w:val="4664FA0A"/>
@@ -1125,7 +1324,7 @@
       </w:pPr>
     </w:lvl>
   </w:abstractNum>
-  <w:abstractNum w:abstractNumId="3" w15:restartNumberingAfterBreak="0">
+  <w:abstractNum w:abstractNumId="4" w15:restartNumberingAfterBreak="0">
     <w:nsid w:val="335A47FF"/>
     <w:multiLevelType w:val="hybridMultilevel"/>
     <w:tmpl w:val="C9FEB076"/>
@@ -1211,7 +1410,7 @@
       </w:pPr>
     </w:lvl>
   </w:abstractNum>
-  <w:abstractNum w:abstractNumId="4" w15:restartNumberingAfterBreak="0">
+  <w:abstractNum w:abstractNumId="5" w15:restartNumberingAfterBreak="0">
     <w:nsid w:val="38224148"/>
     <w:multiLevelType w:val="hybridMultilevel"/>
     <w:tmpl w:val="5E2642E6"/>
@@ -1297,7 +1496,7 @@
       </w:pPr>
     </w:lvl>
   </w:abstractNum>
-  <w:abstractNum w:abstractNumId="5" w15:restartNumberingAfterBreak="0">
+  <w:abstractNum w:abstractNumId="6" w15:restartNumberingAfterBreak="0">
     <w:nsid w:val="60A26EA6"/>
     <w:multiLevelType w:val="hybridMultilevel"/>
     <w:tmpl w:val="6C161DB2"/>
@@ -1383,17 +1582,103 @@
       </w:pPr>
     </w:lvl>
   </w:abstractNum>
+  <w:abstractNum w:abstractNumId="7" w15:restartNumberingAfterBreak="0">
+    <w:nsid w:val="68AF4DD5"/>
+    <w:multiLevelType w:val="hybridMultilevel"/>
+    <w:tmpl w:val="606ED966"/>
+    <w:lvl w:ilvl="0" w:tplc="0809000F">
+      <w:start w:val="1"/>
+      <w:numFmt w:val="decimal"/>
+      <w:lvlText w:val="%1."/>
+      <w:lvlJc w:val="left"/>
+      <w:pPr>
+        <w:ind w:left="720" w:hanging="360"/>
+      </w:pPr>
+    </w:lvl>
+    <w:lvl w:ilvl="1" w:tplc="08090019" w:tentative="1">
+      <w:start w:val="1"/>
+      <w:numFmt w:val="lowerLetter"/>
+      <w:lvlText w:val="%2."/>
+      <w:lvlJc w:val="left"/>
+      <w:pPr>
+        <w:ind w:left="1440" w:hanging="360"/>
+      </w:pPr>
+    </w:lvl>
+    <w:lvl w:ilvl="2" w:tplc="0809001B" w:tentative="1">
+      <w:start w:val="1"/>
+      <w:numFmt w:val="lowerRoman"/>
+      <w:lvlText w:val="%3."/>
+      <w:lvlJc w:val="right"/>
+      <w:pPr>
+        <w:ind w:left="2160" w:hanging="180"/>
+      </w:pPr>
+    </w:lvl>
+    <w:lvl w:ilvl="3" w:tplc="0809000F" w:tentative="1">
+      <w:start w:val="1"/>
+      <w:numFmt w:val="decimal"/>
+      <w:lvlText w:val="%4."/>
+      <w:lvlJc w:val="left"/>
+      <w:pPr>
+        <w:ind w:left="2880" w:hanging="360"/>
+      </w:pPr>
+    </w:lvl>
+    <w:lvl w:ilvl="4" w:tplc="08090019" w:tentative="1">
+      <w:start w:val="1"/>
+      <w:numFmt w:val="lowerLetter"/>
+      <w:lvlText w:val="%5."/>
+      <w:lvlJc w:val="left"/>
+      <w:pPr>
+        <w:ind w:left="3600" w:hanging="360"/>
+      </w:pPr>
+    </w:lvl>
+    <w:lvl w:ilvl="5" w:tplc="0809001B" w:tentative="1">
+      <w:start w:val="1"/>
+      <w:numFmt w:val="lowerRoman"/>
+      <w:lvlText w:val="%6."/>
+      <w:lvlJc w:val="right"/>
+      <w:pPr>
+        <w:ind w:left="4320" w:hanging="180"/>
+      </w:pPr>
+    </w:lvl>
+    <w:lvl w:ilvl="6" w:tplc="0809000F" w:tentative="1">
+      <w:start w:val="1"/>
+      <w:numFmt w:val="decimal"/>
+      <w:lvlText w:val="%7."/>
+      <w:lvlJc w:val="left"/>
+      <w:pPr>
+        <w:ind w:left="5040" w:hanging="360"/>
+      </w:pPr>
+    </w:lvl>
+    <w:lvl w:ilvl="7" w:tplc="08090019" w:tentative="1">
+      <w:start w:val="1"/>
+      <w:numFmt w:val="lowerLetter"/>
+      <w:lvlText w:val="%8."/>
+      <w:lvlJc w:val="left"/>
+      <w:pPr>
+        <w:ind w:left="5760" w:hanging="360"/>
+      </w:pPr>
+    </w:lvl>
+    <w:lvl w:ilvl="8" w:tplc="0809001B" w:tentative="1">
+      <w:start w:val="1"/>
+      <w:numFmt w:val="lowerRoman"/>
+      <w:lvlText w:val="%9."/>
+      <w:lvlJc w:val="right"/>
+      <w:pPr>
+        <w:ind w:left="6480" w:hanging="180"/>
+      </w:pPr>
+    </w:lvl>
+  </w:abstractNum>
   <w:num w:numId="1" w16cid:durableId="1727414069">
-    <w:abstractNumId w:val="2"/>
+    <w:abstractNumId w:val="3"/>
   </w:num>
   <w:num w:numId="2" w16cid:durableId="441458316">
-    <w:abstractNumId w:val="0"/>
+    <w:abstractNumId w:val="1"/>
   </w:num>
   <w:num w:numId="3" w16cid:durableId="122045343">
-    <w:abstractNumId w:val="5"/>
+    <w:abstractNumId w:val="6"/>
   </w:num>
   <w:num w:numId="4" w16cid:durableId="740370251">
-    <w:abstractNumId w:val="2"/>
+    <w:abstractNumId w:val="3"/>
     <w:lvlOverride w:ilvl="0">
       <w:startOverride w:val="1"/>
     </w:lvlOverride>
@@ -1423,7 +1708,7 @@
     </w:lvlOverride>
   </w:num>
   <w:num w:numId="5" w16cid:durableId="29645142">
-    <w:abstractNumId w:val="0"/>
+    <w:abstractNumId w:val="1"/>
     <w:lvlOverride w:ilvl="0">
       <w:startOverride w:val="1"/>
     </w:lvlOverride>
@@ -1453,13 +1738,19 @@
     </w:lvlOverride>
   </w:num>
   <w:num w:numId="6" w16cid:durableId="235021382">
+    <w:abstractNumId w:val="5"/>
+  </w:num>
+  <w:num w:numId="7" w16cid:durableId="1588613789">
+    <w:abstractNumId w:val="2"/>
+  </w:num>
+  <w:num w:numId="8" w16cid:durableId="33309758">
     <w:abstractNumId w:val="4"/>
   </w:num>
-  <w:num w:numId="7" w16cid:durableId="1588613789">
-    <w:abstractNumId w:val="1"/>
+  <w:num w:numId="9" w16cid:durableId="822158530">
+    <w:abstractNumId w:val="7"/>
   </w:num>
-  <w:num w:numId="8" w16cid:durableId="33309758">
-    <w:abstractNumId w:val="3"/>
+  <w:num w:numId="10" w16cid:durableId="1753116639">
+    <w:abstractNumId w:val="0"/>
   </w:num>
 </w:numbering>
 </file>
@@ -1864,6 +2155,7 @@
   <w:style w:type="paragraph" w:default="1" w:styleId="Normal">
     <w:name w:val="Normal"/>
     <w:qFormat/>
+    <w:rsid w:val="004A3C2B"/>
     <w:rPr>
       <w:lang w:val="cs-CZ"/>
     </w:rPr>
@@ -1895,7 +2187,6 @@
     <w:next w:val="Normal"/>
     <w:link w:val="Heading2Char"/>
     <w:uiPriority w:val="9"/>
-    <w:semiHidden/>
     <w:unhideWhenUsed/>
     <w:qFormat/>
     <w:rsid w:val="00D80057"/>
@@ -2070,6 +2361,7 @@
   <w:style w:type="character" w:default="1" w:styleId="DefaultParagraphFont">
     <w:name w:val="Default Paragraph Font"/>
     <w:uiPriority w:val="1"/>
+    <w:semiHidden/>
     <w:unhideWhenUsed/>
   </w:style>
   <w:style w:type="table" w:default="1" w:styleId="TableNormal">
@@ -2111,7 +2403,6 @@
     <w:basedOn w:val="DefaultParagraphFont"/>
     <w:link w:val="Heading2"/>
     <w:uiPriority w:val="9"/>
-    <w:semiHidden/>
     <w:rsid w:val="00D80057"/>
     <w:rPr>
       <w:rFonts w:asciiTheme="majorHAnsi" w:eastAsiaTheme="majorEastAsia" w:hAnsiTheme="majorHAnsi" w:cstheme="majorBidi"/>

</xml_diff>

<commit_message>
Extra use case descriptions
</commit_message>
<xml_diff>
--- a/dokumentace/Specifikace.docx
+++ b/dokumentace/Specifikace.docx
@@ -209,6 +209,57 @@
       </w:r>
     </w:p>
     <w:p>
+      <w:pPr>
+        <w:pStyle w:val="ListParagraph"/>
+        <w:numPr>
+          <w:ilvl w:val="0"/>
+          <w:numId w:val="2"/>
+        </w:numPr>
+      </w:pPr>
+      <w:r>
+        <w:t>V kroku 4: Pokud již v databázi existuje pacient se stejným rodným číslem:</w:t>
+      </w:r>
+    </w:p>
+    <w:p>
+      <w:pPr>
+        <w:pStyle w:val="ListParagraph"/>
+        <w:numPr>
+          <w:ilvl w:val="1"/>
+          <w:numId w:val="2"/>
+        </w:numPr>
+        <w:ind w:firstLine="414"/>
+      </w:pPr>
+      <w:r>
+        <w:t>Systém neuloží pacienta do databáze.</w:t>
+      </w:r>
+    </w:p>
+    <w:p>
+      <w:pPr>
+        <w:pStyle w:val="ListParagraph"/>
+        <w:numPr>
+          <w:ilvl w:val="1"/>
+          <w:numId w:val="2"/>
+        </w:numPr>
+        <w:ind w:firstLine="414"/>
+      </w:pPr>
+      <w:r>
+        <w:t>Systém vypíše varovnou hlášku.</w:t>
+      </w:r>
+    </w:p>
+    <w:p>
+      <w:pPr>
+        <w:pStyle w:val="ListParagraph"/>
+        <w:numPr>
+          <w:ilvl w:val="1"/>
+          <w:numId w:val="2"/>
+        </w:numPr>
+        <w:ind w:left="1418" w:hanging="284"/>
+      </w:pPr>
+      <w:r>
+        <w:t>Lékaři se zobrazí formulář s dosud vyplněnými údaji a červeně označeným polem „Rodné číslo“.</w:t>
+      </w:r>
+    </w:p>
+    <w:p>
       <w:r>
         <w:t>Vstupní podmínky:</w:t>
       </w:r>
@@ -263,6 +314,7 @@
     </w:p>
     <w:p>
       <w:r>
+        <w:lastRenderedPageBreak/>
         <w:t>Hlavní scénář:</w:t>
       </w:r>
       <w:r>
@@ -322,7 +374,6 @@
     </w:p>
     <w:p>
       <w:r>
-        <w:lastRenderedPageBreak/>
         <w:t>Vstupní podmínky:</w:t>
       </w:r>
     </w:p>
@@ -500,7 +551,15 @@
         <w:t>Aplikace zobrazí prázdný seznam a vypíše</w:t>
       </w:r>
       <w:r>
-        <w:t xml:space="preserve"> hlíšku.</w:t>
+        <w:t xml:space="preserve"> </w:t>
+      </w:r>
+      <w:proofErr w:type="spellStart"/>
+      <w:r>
+        <w:t>hlíšku</w:t>
+      </w:r>
+      <w:proofErr w:type="spellEnd"/>
+      <w:r>
+        <w:t>.</w:t>
       </w:r>
     </w:p>
     <w:p>
@@ -546,6 +605,7 @@
     </w:p>
     <w:p>
       <w:r>
+        <w:lastRenderedPageBreak/>
         <w:t xml:space="preserve">Stručný popis: </w:t>
       </w:r>
       <w:r>
@@ -587,7 +647,6 @@
         </w:numPr>
       </w:pPr>
       <w:r>
-        <w:lastRenderedPageBreak/>
         <w:t>Aplikace zobrazí formulář pro předpis léčiva.</w:t>
       </w:r>
     </w:p>
@@ -637,7 +696,13 @@
         </w:numPr>
       </w:pPr>
       <w:r>
-        <w:t>V kroku 8: Pokud jsou některé údaje vyplněny v chybném formátu:</w:t>
+        <w:t xml:space="preserve">V kroku </w:t>
+      </w:r>
+      <w:r>
+        <w:t>5</w:t>
+      </w:r>
+      <w:r>
+        <w:t>: Pokud jsou některé údaje vyplněny v chybném formátu:</w:t>
       </w:r>
     </w:p>
     <w:p>
@@ -804,6 +869,7 @@
     </w:p>
     <w:p>
       <w:r>
+        <w:lastRenderedPageBreak/>
         <w:t>Alternativní scénáře:</w:t>
       </w:r>
     </w:p>
@@ -818,7 +884,15 @@
         <w:t>Lékař má zobrazený detail konkrétního pacienta.</w:t>
       </w:r>
       <w:r>
-        <w:t xml:space="preserve"> (přístup skrz Vyhledat pacienta (kroky 1-4)/výběr z celého seznamu)</w:t>
+        <w:t xml:space="preserve"> (přístup skrz Vyhledat pacienta (kroky 1-</w:t>
+      </w:r>
+      <w:proofErr w:type="gramStart"/>
+      <w:r>
+        <w:t>4)/</w:t>
+      </w:r>
+      <w:proofErr w:type="gramEnd"/>
+      <w:r>
+        <w:t>výběr z celého seznamu)</w:t>
       </w:r>
     </w:p>
     <w:p>
@@ -853,11 +927,279 @@
         <w:pStyle w:val="Heading2"/>
       </w:pPr>
       <w:r>
+        <w:t>Id: PU-0</w:t>
+      </w:r>
+      <w:r>
+        <w:t>6</w:t>
+      </w:r>
+    </w:p>
+    <w:p>
+      <w:r>
+        <w:t xml:space="preserve">Název: </w:t>
+      </w:r>
+      <w:r>
+        <w:t>Zobrazit interakce</w:t>
+      </w:r>
+    </w:p>
+    <w:p>
+      <w:r>
+        <w:t xml:space="preserve">Stručný popis: Aplikace umožní lékaři </w:t>
+      </w:r>
+      <w:r>
+        <w:t>procházet interakce mezi léčivy</w:t>
+      </w:r>
+      <w:r>
+        <w:t>.</w:t>
+      </w:r>
+    </w:p>
+    <w:p>
+      <w:r>
+        <w:t xml:space="preserve">Hlavní scénář: </w:t>
+      </w:r>
+    </w:p>
+    <w:p>
+      <w:pPr>
+        <w:pStyle w:val="ListParagraph"/>
+        <w:numPr>
+          <w:ilvl w:val="0"/>
+          <w:numId w:val="8"/>
+        </w:numPr>
+        <w:spacing w:line="276" w:lineRule="auto"/>
+      </w:pPr>
+      <w:r>
+        <w:t>Lékař přejde do sekce „Interakce“ a vybere jednu z kategorií léčiv.</w:t>
+      </w:r>
+    </w:p>
+    <w:p>
+      <w:pPr>
+        <w:pStyle w:val="ListParagraph"/>
+        <w:numPr>
+          <w:ilvl w:val="0"/>
+          <w:numId w:val="8"/>
+        </w:numPr>
+      </w:pPr>
+      <w:r>
+        <w:t>Aplikace zobrazí seznam léčiv z této kategorie a u každého informaci o obsahované léčivé látce.</w:t>
+      </w:r>
+    </w:p>
+    <w:p>
+      <w:pPr>
+        <w:pStyle w:val="ListParagraph"/>
+        <w:numPr>
+          <w:ilvl w:val="0"/>
+          <w:numId w:val="8"/>
+        </w:numPr>
+      </w:pPr>
+      <w:r>
+        <w:t>Lékař klikne na konkrétní léčivo.</w:t>
+      </w:r>
+    </w:p>
+    <w:p>
+      <w:pPr>
+        <w:pStyle w:val="ListParagraph"/>
+        <w:numPr>
+          <w:ilvl w:val="0"/>
+          <w:numId w:val="8"/>
+        </w:numPr>
+      </w:pPr>
+      <w:r>
+        <w:t>Aplikace zobrazí seznam interagujících léčiv s informacemi o léčivých látkách.</w:t>
+      </w:r>
+    </w:p>
+    <w:p>
+      <w:r>
+        <w:t>Alternativní scénáře:</w:t>
+      </w:r>
+    </w:p>
+    <w:p>
+      <w:r>
+        <w:t>Vstupní podmínky: Hledan</w:t>
+      </w:r>
+      <w:r>
+        <w:t>é léčivo má v databázi zavedenou alespoň jednu interakci</w:t>
+      </w:r>
+      <w:r>
+        <w:t>.</w:t>
+      </w:r>
+    </w:p>
+    <w:p>
+      <w:r>
+        <w:t xml:space="preserve">Výstupní podmínky: </w:t>
+      </w:r>
+      <w:r>
+        <w:t>Lékaři je zobrazen seznam interakcí léčiva s jinými a je mu umožněno zanášet další interakce.</w:t>
+      </w:r>
+    </w:p>
+    <w:p/>
+    <w:p>
+      <w:pPr>
+        <w:pStyle w:val="Heading2"/>
+      </w:pPr>
+      <w:r>
+        <w:t>Id: PU-0</w:t>
+      </w:r>
+      <w:r>
+        <w:t>7</w:t>
+      </w:r>
+    </w:p>
+    <w:p>
+      <w:r>
+        <w:t xml:space="preserve">Název: </w:t>
+      </w:r>
+      <w:r>
+        <w:t>Přidat</w:t>
+      </w:r>
+      <w:r>
+        <w:t xml:space="preserve"> interakc</w:t>
+      </w:r>
+      <w:r>
+        <w:t>i</w:t>
+      </w:r>
+    </w:p>
+    <w:p>
+      <w:r>
+        <w:t>Stručný popis: Aplikace umožní lékaři</w:t>
+      </w:r>
+      <w:r>
+        <w:t xml:space="preserve"> přidávat interakce mezi léčivy</w:t>
+      </w:r>
+      <w:r>
+        <w:t>.</w:t>
+      </w:r>
+    </w:p>
+    <w:p>
+      <w:r>
+        <w:t xml:space="preserve">Hlavní scénář: </w:t>
+      </w:r>
+    </w:p>
+    <w:p>
+      <w:pPr>
+        <w:pStyle w:val="ListParagraph"/>
+        <w:numPr>
+          <w:ilvl w:val="0"/>
+          <w:numId w:val="11"/>
+        </w:numPr>
+      </w:pPr>
+      <w:r>
+        <w:t>Lékař přejde do sekce „Interakce“ a vybere jednu z kategorií léčiv.</w:t>
+      </w:r>
+    </w:p>
+    <w:p>
+      <w:pPr>
+        <w:pStyle w:val="ListParagraph"/>
+        <w:numPr>
+          <w:ilvl w:val="0"/>
+          <w:numId w:val="11"/>
+        </w:numPr>
+      </w:pPr>
+      <w:r>
+        <w:t>Aplikace zobrazí seznam léčiv z této kategorie a u každého informaci o obsahované léčivé látce.</w:t>
+      </w:r>
+    </w:p>
+    <w:p>
+      <w:pPr>
+        <w:pStyle w:val="ListParagraph"/>
+        <w:numPr>
+          <w:ilvl w:val="0"/>
+          <w:numId w:val="11"/>
+        </w:numPr>
+      </w:pPr>
+      <w:r>
+        <w:t>Lékař klikne na konkrétní léčivo.</w:t>
+      </w:r>
+    </w:p>
+    <w:p>
+      <w:pPr>
+        <w:pStyle w:val="ListParagraph"/>
+        <w:numPr>
+          <w:ilvl w:val="0"/>
+          <w:numId w:val="11"/>
+        </w:numPr>
+      </w:pPr>
+      <w:r>
+        <w:t>Aplikace zobrazí seznam interagujících léčiv s informacemi o léčivých látkách.</w:t>
+      </w:r>
+    </w:p>
+    <w:p>
+      <w:pPr>
+        <w:pStyle w:val="ListParagraph"/>
+        <w:numPr>
+          <w:ilvl w:val="0"/>
+          <w:numId w:val="11"/>
+        </w:numPr>
+      </w:pPr>
+      <w:r>
+        <w:t>Lékař vybere „Přidat“.</w:t>
+      </w:r>
+    </w:p>
+    <w:p>
+      <w:pPr>
+        <w:pStyle w:val="ListParagraph"/>
+        <w:numPr>
+          <w:ilvl w:val="0"/>
+          <w:numId w:val="11"/>
+        </w:numPr>
+      </w:pPr>
+      <w:r>
+        <w:t>Aplikace zobrazí formulář pro vytvoření interakce.</w:t>
+      </w:r>
+    </w:p>
+    <w:p>
+      <w:pPr>
+        <w:pStyle w:val="ListParagraph"/>
+        <w:numPr>
+          <w:ilvl w:val="0"/>
+          <w:numId w:val="11"/>
+        </w:numPr>
+      </w:pPr>
+      <w:r>
+        <w:t>Lékař vybere některé léčivo z nabídky interagujících léčiv, napíše stručný popis interakce a zvolí „Uložit“.</w:t>
+      </w:r>
+    </w:p>
+    <w:p>
+      <w:pPr>
+        <w:pStyle w:val="ListParagraph"/>
+        <w:numPr>
+          <w:ilvl w:val="0"/>
+          <w:numId w:val="11"/>
+        </w:numPr>
+      </w:pPr>
+      <w:r>
         <w:lastRenderedPageBreak/>
+        <w:t>Systém uloží novou interakci do databáze pod léčivé látky léčiv a zobrazí ji v seznamu interakcí léčiva.</w:t>
+      </w:r>
+    </w:p>
+    <w:p>
+      <w:r>
+        <w:t>Alternativní scénáře:</w:t>
+      </w:r>
+    </w:p>
+    <w:p>
+      <w:r>
+        <w:t>Vstupní podmínky:</w:t>
+      </w:r>
+    </w:p>
+    <w:p>
+      <w:r>
+        <w:t xml:space="preserve">Výstupní podmínky: </w:t>
+      </w:r>
+      <w:r>
+        <w:t xml:space="preserve">Lékaři je zobrazen seznam interakcí léčiva s jinými </w:t>
+      </w:r>
+      <w:r>
+        <w:t>i s nově vytvořenou interakcí.</w:t>
+      </w:r>
+    </w:p>
+    <w:p/>
+    <w:p>
+      <w:pPr>
+        <w:pStyle w:val="Heading2"/>
+      </w:pPr>
+      <w:r>
         <w:t>Id: PU-0</w:t>
       </w:r>
       <w:r>
-        <w:t>6</w:t>
+        <w:t>8</w:t>
       </w:r>
     </w:p>
     <w:p>
@@ -865,7 +1207,7 @@
         <w:t xml:space="preserve">Název: </w:t>
       </w:r>
       <w:r>
-        <w:t>Zobrazit interakce</w:t>
+        <w:t>Přidat neschopenku</w:t>
       </w:r>
     </w:p>
     <w:p>
@@ -873,7 +1215,7 @@
         <w:t xml:space="preserve">Stručný popis: Aplikace umožní lékaři </w:t>
       </w:r>
       <w:r>
-        <w:t>procházet a přidávat interakce mezi léčivy</w:t>
+        <w:t>vystavovat pacientům pracovní neschopnosti</w:t>
       </w:r>
       <w:r>
         <w:t>.</w:t>
@@ -889,47 +1231,72 @@
         <w:pStyle w:val="ListParagraph"/>
         <w:numPr>
           <w:ilvl w:val="0"/>
-          <w:numId w:val="8"/>
-        </w:numPr>
-      </w:pPr>
-      <w:r>
-        <w:t>Lékař přejde do sekce „Interakce“ a vybere jednu z kategorií léčiv.</w:t>
-      </w:r>
-    </w:p>
-    <w:p>
-      <w:pPr>
-        <w:pStyle w:val="ListParagraph"/>
-        <w:numPr>
-          <w:ilvl w:val="0"/>
-          <w:numId w:val="8"/>
-        </w:numPr>
-      </w:pPr>
-      <w:r>
-        <w:t>Aplikace zobrazí seznam léčiv z této kategorie a u každého informaci o obsahované léčivé látce.</w:t>
-      </w:r>
-    </w:p>
-    <w:p>
-      <w:pPr>
-        <w:pStyle w:val="ListParagraph"/>
-        <w:numPr>
-          <w:ilvl w:val="0"/>
-          <w:numId w:val="8"/>
-        </w:numPr>
-      </w:pPr>
-      <w:r>
-        <w:t>Lékař klikne na konkrétní léčivo.</w:t>
-      </w:r>
-    </w:p>
-    <w:p>
-      <w:pPr>
-        <w:pStyle w:val="ListParagraph"/>
-        <w:numPr>
-          <w:ilvl w:val="0"/>
-          <w:numId w:val="8"/>
-        </w:numPr>
-      </w:pPr>
-      <w:r>
-        <w:t>Aplikace zobrazí seznam interagujících léčiv s informacemi o léčivých látkách.</w:t>
+          <w:numId w:val="13"/>
+        </w:numPr>
+        <w:spacing w:line="276" w:lineRule="auto"/>
+      </w:pPr>
+      <w:r>
+        <w:t>Lékař přejde se na stránce přesune k seznamu pacientových neschopenek a zvolí „Přidat neschopenku“.</w:t>
+      </w:r>
+    </w:p>
+    <w:p>
+      <w:pPr>
+        <w:pStyle w:val="ListParagraph"/>
+        <w:numPr>
+          <w:ilvl w:val="0"/>
+          <w:numId w:val="13"/>
+        </w:numPr>
+      </w:pPr>
+      <w:r>
+        <w:t xml:space="preserve">Aplikace zobrazí </w:t>
+      </w:r>
+      <w:r>
+        <w:t>formulář pro vystavení neschopenky</w:t>
+      </w:r>
+      <w:r>
+        <w:t>.</w:t>
+      </w:r>
+    </w:p>
+    <w:p>
+      <w:pPr>
+        <w:pStyle w:val="ListParagraph"/>
+        <w:numPr>
+          <w:ilvl w:val="0"/>
+          <w:numId w:val="13"/>
+        </w:numPr>
+      </w:pPr>
+      <w:r>
+        <w:t xml:space="preserve">Lékař </w:t>
+      </w:r>
+      <w:r>
+        <w:t>vy</w:t>
+      </w:r>
+      <w:r>
+        <w:t>bere</w:t>
+      </w:r>
+      <w:r>
+        <w:t xml:space="preserve"> počáteční datum, aktivní adresu pacienta (kde bude v průběhu neschopenky pobývat) a jeho zaměstnavatele</w:t>
+      </w:r>
+      <w:r>
+        <w:t>.</w:t>
+      </w:r>
+    </w:p>
+    <w:p>
+      <w:pPr>
+        <w:pStyle w:val="ListParagraph"/>
+        <w:numPr>
+          <w:ilvl w:val="0"/>
+          <w:numId w:val="13"/>
+        </w:numPr>
+      </w:pPr>
+      <w:r>
+        <w:t xml:space="preserve">Aplikace </w:t>
+      </w:r>
+      <w:r>
+        <w:t>uloží novou neschopenku do seznamu pacientových neschopenek a seznamu všech neschopenek</w:t>
+      </w:r>
+      <w:r>
+        <w:t>.</w:t>
       </w:r>
     </w:p>
     <w:p>
@@ -939,21 +1306,382 @@
     </w:p>
     <w:p>
       <w:r>
-        <w:t>Vstupní podmínky: Hledan</w:t>
-      </w:r>
-      <w:r>
-        <w:t>é léčivo má v databázi zavedenou alespoň jednu interakci</w:t>
+        <w:t xml:space="preserve">Vstupní podmínky: </w:t>
+      </w:r>
+      <w:r>
+        <w:t>Lékař má zobrazený detail konkrétního pacienta. (přístup skrz Vyhledat pacienta (kroky 1-</w:t>
+      </w:r>
+      <w:proofErr w:type="gramStart"/>
+      <w:r>
+        <w:t>4)/</w:t>
+      </w:r>
+      <w:proofErr w:type="gramEnd"/>
+      <w:r>
+        <w:t>výběr z celého seznamu)</w:t>
+      </w:r>
+    </w:p>
+    <w:p>
+      <w:r>
+        <w:t xml:space="preserve">Výstupní podmínky: </w:t>
+      </w:r>
+      <w:r>
+        <w:t>Nová neschopenka je uložena do databáze, seznamu všech neschopenek a seznamu neschopenek konkrétního pacienta</w:t>
       </w:r>
       <w:r>
         <w:t>.</w:t>
       </w:r>
     </w:p>
+    <w:p/>
+    <w:p>
+      <w:pPr>
+        <w:pStyle w:val="Heading2"/>
+      </w:pPr>
+      <w:r>
+        <w:t>Id: PU-0</w:t>
+      </w:r>
+      <w:r>
+        <w:t>9</w:t>
+      </w:r>
+    </w:p>
+    <w:p>
+      <w:r>
+        <w:t xml:space="preserve">Název: </w:t>
+      </w:r>
+      <w:r>
+        <w:t>Ukončit</w:t>
+      </w:r>
+      <w:r>
+        <w:t xml:space="preserve"> neschopenku</w:t>
+      </w:r>
+    </w:p>
+    <w:p>
+      <w:r>
+        <w:t xml:space="preserve">Stručný popis: Aplikace umožní lékaři </w:t>
+      </w:r>
+      <w:r>
+        <w:t>ukončov</w:t>
+      </w:r>
+      <w:r>
+        <w:t>at pacientům pracovní neschopnosti</w:t>
+      </w:r>
+      <w:r>
+        <w:t>.</w:t>
+      </w:r>
+    </w:p>
+    <w:p>
+      <w:r>
+        <w:t xml:space="preserve">Hlavní scénář: </w:t>
+      </w:r>
+    </w:p>
+    <w:p>
+      <w:pPr>
+        <w:pStyle w:val="ListParagraph"/>
+        <w:numPr>
+          <w:ilvl w:val="0"/>
+          <w:numId w:val="14"/>
+        </w:numPr>
+        <w:spacing w:line="276" w:lineRule="auto"/>
+      </w:pPr>
+      <w:r>
+        <w:t>Lékař přejde se na stránce přesune k seznamu pacientových neschopenek a zvolí „</w:t>
+      </w:r>
+      <w:r>
+        <w:t>Ukončit</w:t>
+      </w:r>
+      <w:r>
+        <w:t>“.</w:t>
+      </w:r>
+    </w:p>
+    <w:p>
+      <w:pPr>
+        <w:pStyle w:val="ListParagraph"/>
+        <w:numPr>
+          <w:ilvl w:val="0"/>
+          <w:numId w:val="14"/>
+        </w:numPr>
+      </w:pPr>
+      <w:r>
+        <w:t xml:space="preserve">Aplikace zobrazí formulář pro </w:t>
+      </w:r>
+      <w:r>
+        <w:t>ukonče</w:t>
+      </w:r>
+      <w:r>
+        <w:t>ní neschopenky.</w:t>
+      </w:r>
+    </w:p>
+    <w:p>
+      <w:pPr>
+        <w:pStyle w:val="ListParagraph"/>
+        <w:numPr>
+          <w:ilvl w:val="0"/>
+          <w:numId w:val="14"/>
+        </w:numPr>
+      </w:pPr>
+      <w:r>
+        <w:t>Lékař vy</w:t>
+      </w:r>
+      <w:r>
+        <w:t>bere datum konce neschopenky a zvolí „Uložit“</w:t>
+      </w:r>
+      <w:r>
+        <w:t>.</w:t>
+      </w:r>
+    </w:p>
+    <w:p>
+      <w:pPr>
+        <w:pStyle w:val="ListParagraph"/>
+        <w:numPr>
+          <w:ilvl w:val="0"/>
+          <w:numId w:val="14"/>
+        </w:numPr>
+      </w:pPr>
+      <w:r>
+        <w:lastRenderedPageBreak/>
+        <w:t xml:space="preserve">Aplikace </w:t>
+      </w:r>
+      <w:r>
+        <w:t xml:space="preserve">upraví </w:t>
+      </w:r>
+      <w:r>
+        <w:t xml:space="preserve">neschopenku </w:t>
+      </w:r>
+      <w:r>
+        <w:t>v</w:t>
+      </w:r>
+      <w:r>
+        <w:t xml:space="preserve"> seznamu pacientových neschopenek a</w:t>
+      </w:r>
+      <w:r>
+        <w:t xml:space="preserve"> v</w:t>
+      </w:r>
+      <w:r>
+        <w:t xml:space="preserve"> seznamu všech neschopenek.</w:t>
+      </w:r>
+    </w:p>
+    <w:p>
+      <w:r>
+        <w:t>Alternativní scénáře:</w:t>
+      </w:r>
+    </w:p>
+    <w:p>
+      <w:r>
+        <w:t xml:space="preserve">Vstupní podmínky: </w:t>
+      </w:r>
+      <w:r>
+        <w:t>Lékař má zobrazený detail konkrétního pacienta. (přístup skrz Vyhledat pacienta (kroky 1-</w:t>
+      </w:r>
+      <w:proofErr w:type="gramStart"/>
+      <w:r>
+        <w:t>4)/</w:t>
+      </w:r>
+      <w:proofErr w:type="gramEnd"/>
+      <w:r>
+        <w:t>výběr z celého seznamu)</w:t>
+      </w:r>
+    </w:p>
     <w:p>
       <w:r>
         <w:t xml:space="preserve">Výstupní podmínky: </w:t>
       </w:r>
       <w:r>
-        <w:t>Lékaři je zobrazen seznam interakcí léčiva s jinými a je mu umožněno zanášet další interakce.</w:t>
+        <w:t>Neschopenka je u</w:t>
+      </w:r>
+      <w:r>
+        <w:t>praven</w:t>
+      </w:r>
+      <w:r>
+        <w:t xml:space="preserve">a </w:t>
+      </w:r>
+      <w:r>
+        <w:t>v</w:t>
+      </w:r>
+      <w:r>
+        <w:t xml:space="preserve"> databáze, seznamu všech neschopenek a seznamu neschopenek konkrétního pacienta.</w:t>
+      </w:r>
+    </w:p>
+    <w:p/>
+    <w:p>
+      <w:pPr>
+        <w:pStyle w:val="Heading2"/>
+      </w:pPr>
+      <w:r>
+        <w:t>Id: PU-</w:t>
+      </w:r>
+      <w:r>
+        <w:t>10</w:t>
+      </w:r>
+    </w:p>
+    <w:p>
+      <w:r>
+        <w:t xml:space="preserve">Název: </w:t>
+      </w:r>
+      <w:r>
+        <w:t>Přidat nového pacienta</w:t>
+      </w:r>
+    </w:p>
+    <w:p>
+      <w:r>
+        <w:t xml:space="preserve">Stručný popis: </w:t>
+      </w:r>
+      <w:r>
+        <w:t xml:space="preserve">Aplikace umožní lékaři </w:t>
+      </w:r>
+      <w:r>
+        <w:t xml:space="preserve">upravovat v kartotéce </w:t>
+      </w:r>
+      <w:r>
+        <w:t>pacient</w:t>
+      </w:r>
+      <w:r>
+        <w:t>ovy údaje</w:t>
+      </w:r>
+      <w:r>
+        <w:t>.</w:t>
+      </w:r>
+    </w:p>
+    <w:p>
+      <w:r>
+        <w:t>Hlavní scénář:</w:t>
+      </w:r>
+      <w:r>
+        <w:t xml:space="preserve"> </w:t>
+      </w:r>
+    </w:p>
+    <w:p>
+      <w:pPr>
+        <w:numPr>
+          <w:ilvl w:val="0"/>
+          <w:numId w:val="17"/>
+        </w:numPr>
+      </w:pPr>
+      <w:r>
+        <w:t>Vyhledat pacienta (PU-03) kroky 1-4.</w:t>
+      </w:r>
+    </w:p>
+    <w:p>
+      <w:pPr>
+        <w:numPr>
+          <w:ilvl w:val="0"/>
+          <w:numId w:val="17"/>
+        </w:numPr>
+      </w:pPr>
+      <w:r>
+        <w:t>Lékař klikne na ikonku tužtičky vedle pacientových údajů.</w:t>
+      </w:r>
+    </w:p>
+    <w:p>
+      <w:pPr>
+        <w:pStyle w:val="ListParagraph"/>
+        <w:numPr>
+          <w:ilvl w:val="0"/>
+          <w:numId w:val="17"/>
+        </w:numPr>
+      </w:pPr>
+      <w:r>
+        <w:t xml:space="preserve">Aplikace zobrazí formulář pro zadání pacientových údajů včetně </w:t>
+      </w:r>
+      <w:r>
+        <w:t>křestního</w:t>
+      </w:r>
+      <w:r>
+        <w:t xml:space="preserve"> jména, příjmení, data narození, čísla pojišťovny, trvalého bydliště a telefonního čísla.</w:t>
+      </w:r>
+    </w:p>
+    <w:p>
+      <w:pPr>
+        <w:pStyle w:val="ListParagraph"/>
+        <w:numPr>
+          <w:ilvl w:val="0"/>
+          <w:numId w:val="17"/>
+        </w:numPr>
+      </w:pPr>
+      <w:r>
+        <w:t>Lékař vyplní všechny položky formuláře osobními údaji pacienta a stiskne tlačítko „Uložit“.</w:t>
+      </w:r>
+    </w:p>
+    <w:p>
+      <w:pPr>
+        <w:pStyle w:val="ListParagraph"/>
+        <w:numPr>
+          <w:ilvl w:val="0"/>
+          <w:numId w:val="17"/>
+        </w:numPr>
+      </w:pPr>
+      <w:r>
+        <w:t>Aplikace změní v databázi pacienta se všechny vyplněné údaje a zobrazí upravené údaje v jeho kartě.</w:t>
+      </w:r>
+    </w:p>
+    <w:p>
+      <w:r>
+        <w:t>Alternativní scénář</w:t>
+      </w:r>
+      <w:r>
+        <w:t>e</w:t>
+      </w:r>
+      <w:r>
+        <w:t>:</w:t>
+      </w:r>
+    </w:p>
+    <w:p>
+      <w:pPr>
+        <w:pStyle w:val="ListParagraph"/>
+        <w:numPr>
+          <w:ilvl w:val="0"/>
+          <w:numId w:val="2"/>
+        </w:numPr>
+      </w:pPr>
+      <w:r>
+        <w:t>V kroku 4: Pokud jsou některé údaje vyplněny v chybném formátu:</w:t>
+      </w:r>
+    </w:p>
+    <w:p>
+      <w:pPr>
+        <w:pStyle w:val="ListParagraph"/>
+        <w:numPr>
+          <w:ilvl w:val="1"/>
+          <w:numId w:val="2"/>
+        </w:numPr>
+        <w:ind w:left="1134" w:hanging="11"/>
+      </w:pPr>
+      <w:r>
+        <w:t>Systém neuloží změny do databáze.</w:t>
+      </w:r>
+    </w:p>
+    <w:p>
+      <w:pPr>
+        <w:pStyle w:val="ListParagraph"/>
+        <w:numPr>
+          <w:ilvl w:val="1"/>
+          <w:numId w:val="2"/>
+        </w:numPr>
+        <w:ind w:left="1134" w:hanging="11"/>
+      </w:pPr>
+      <w:r>
+        <w:t>Systém vypíše varovnou hlášku.</w:t>
+      </w:r>
+    </w:p>
+    <w:p>
+      <w:pPr>
+        <w:pStyle w:val="ListParagraph"/>
+        <w:numPr>
+          <w:ilvl w:val="1"/>
+          <w:numId w:val="2"/>
+        </w:numPr>
+        <w:ind w:left="1418" w:hanging="295"/>
+      </w:pPr>
+      <w:r>
+        <w:t>Lékaři se zobrazí formulář s dosud vyplněnými údaji a červeně označenými chybně vyplněnými poli, pokračuje krok 3.</w:t>
+      </w:r>
+    </w:p>
+    <w:p>
+      <w:r>
+        <w:t>Vstupní podmínky:</w:t>
+      </w:r>
+    </w:p>
+    <w:p>
+      <w:r>
+        <w:t>Výstupní podmínky: Změny jsou uloženy do pacientovy karty a seznamu pacientů.</w:t>
       </w:r>
     </w:p>
     <w:p/>
@@ -978,6 +1706,92 @@
 <file path=word/numbering.xml><?xml version="1.0" encoding="utf-8"?>
 <w:numbering xmlns:wpc="http://schemas.microsoft.com/office/word/2010/wordprocessingCanvas" xmlns:cx="http://schemas.microsoft.com/office/drawing/2014/chartex" xmlns:cx1="http://schemas.microsoft.com/office/drawing/2015/9/8/chartex" xmlns:cx2="http://schemas.microsoft.com/office/drawing/2015/10/21/chartex" xmlns:cx3="http://schemas.microsoft.com/office/drawing/2016/5/9/chartex" xmlns:cx4="http://schemas.microsoft.com/office/drawing/2016/5/10/chartex" xmlns:cx5="http://schemas.microsoft.com/office/drawing/2016/5/11/chartex" xmlns:cx6="http://schemas.microsoft.com/office/drawing/2016/5/12/chartex" xmlns:cx7="http://schemas.microsoft.com/office/drawing/2016/5/13/chartex" xmlns:cx8="http://schemas.microsoft.com/office/drawing/2016/5/14/chartex" xmlns:mc="http://schemas.openxmlformats.org/markup-compatibility/2006" xmlns:aink="http://schemas.microsoft.com/office/drawing/2016/ink" xmlns:am3d="http://schemas.microsoft.com/office/drawing/2017/model3d" xmlns:o="urn:schemas-microsoft-com:office:office" xmlns:oel="http://schemas.microsoft.com/office/2019/extlst" xmlns:r="http://schemas.openxmlformats.org/officeDocument/2006/relationships" xmlns:m="http://schemas.openxmlformats.org/officeDocument/2006/math" xmlns:v="urn:schemas-microsoft-com:vml" xmlns:wp14="http://schemas.microsoft.com/office/word/2010/wordprocessingDrawing" xmlns:wp="http://schemas.openxmlformats.org/drawingml/2006/wordprocessingDrawing" xmlns:w10="urn:schemas-microsoft-com:office:word" xmlns:w="http://schemas.openxmlformats.org/wordprocessingml/2006/main" xmlns:w14="http://schemas.microsoft.com/office/word/2010/wordml" xmlns:w15="http://schemas.microsoft.com/office/word/2012/wordml" xmlns:w16cex="http://schemas.microsoft.com/office/word/2018/wordml/cex" xmlns:w16cid="http://schemas.microsoft.com/office/word/2016/wordml/cid" xmlns:w16="http://schemas.microsoft.com/office/word/2018/wordml" xmlns:w16du="http://schemas.microsoft.com/office/word/2023/wordml/word16du" xmlns:w16sdtdh="http://schemas.microsoft.com/office/word/2020/wordml/sdtdatahash" xmlns:w16sdtfl="http://schemas.microsoft.com/office/word/2024/wordml/sdtformatlock" xmlns:w16se="http://schemas.microsoft.com/office/word/2015/wordml/symex" xmlns:wpg="http://schemas.microsoft.com/office/word/2010/wordprocessingGroup" xmlns:wpi="http://schemas.microsoft.com/office/word/2010/wordprocessingInk" xmlns:wne="http://schemas.microsoft.com/office/word/2006/wordml" xmlns:wps="http://schemas.microsoft.com/office/word/2010/wordprocessingShape" mc:Ignorable="w14 w15 w16se w16cid w16 w16cex w16sdtdh w16sdtfl w16du wp14">
   <w:abstractNum w:abstractNumId="0" w15:restartNumberingAfterBreak="0">
+    <w:nsid w:val="08235B41"/>
+    <w:multiLevelType w:val="hybridMultilevel"/>
+    <w:tmpl w:val="C9FEB076"/>
+    <w:lvl w:ilvl="0" w:tplc="FFFFFFFF">
+      <w:start w:val="1"/>
+      <w:numFmt w:val="decimal"/>
+      <w:lvlText w:val="%1."/>
+      <w:lvlJc w:val="left"/>
+      <w:pPr>
+        <w:ind w:left="720" w:hanging="360"/>
+      </w:pPr>
+    </w:lvl>
+    <w:lvl w:ilvl="1" w:tplc="FFFFFFFF" w:tentative="1">
+      <w:start w:val="1"/>
+      <w:numFmt w:val="lowerLetter"/>
+      <w:lvlText w:val="%2."/>
+      <w:lvlJc w:val="left"/>
+      <w:pPr>
+        <w:ind w:left="1440" w:hanging="360"/>
+      </w:pPr>
+    </w:lvl>
+    <w:lvl w:ilvl="2" w:tplc="FFFFFFFF" w:tentative="1">
+      <w:start w:val="1"/>
+      <w:numFmt w:val="lowerRoman"/>
+      <w:lvlText w:val="%3."/>
+      <w:lvlJc w:val="right"/>
+      <w:pPr>
+        <w:ind w:left="2160" w:hanging="180"/>
+      </w:pPr>
+    </w:lvl>
+    <w:lvl w:ilvl="3" w:tplc="FFFFFFFF" w:tentative="1">
+      <w:start w:val="1"/>
+      <w:numFmt w:val="decimal"/>
+      <w:lvlText w:val="%4."/>
+      <w:lvlJc w:val="left"/>
+      <w:pPr>
+        <w:ind w:left="2880" w:hanging="360"/>
+      </w:pPr>
+    </w:lvl>
+    <w:lvl w:ilvl="4" w:tplc="FFFFFFFF" w:tentative="1">
+      <w:start w:val="1"/>
+      <w:numFmt w:val="lowerLetter"/>
+      <w:lvlText w:val="%5."/>
+      <w:lvlJc w:val="left"/>
+      <w:pPr>
+        <w:ind w:left="3600" w:hanging="360"/>
+      </w:pPr>
+    </w:lvl>
+    <w:lvl w:ilvl="5" w:tplc="FFFFFFFF" w:tentative="1">
+      <w:start w:val="1"/>
+      <w:numFmt w:val="lowerRoman"/>
+      <w:lvlText w:val="%6."/>
+      <w:lvlJc w:val="right"/>
+      <w:pPr>
+        <w:ind w:left="4320" w:hanging="180"/>
+      </w:pPr>
+    </w:lvl>
+    <w:lvl w:ilvl="6" w:tplc="FFFFFFFF" w:tentative="1">
+      <w:start w:val="1"/>
+      <w:numFmt w:val="decimal"/>
+      <w:lvlText w:val="%7."/>
+      <w:lvlJc w:val="left"/>
+      <w:pPr>
+        <w:ind w:left="5040" w:hanging="360"/>
+      </w:pPr>
+    </w:lvl>
+    <w:lvl w:ilvl="7" w:tplc="FFFFFFFF" w:tentative="1">
+      <w:start w:val="1"/>
+      <w:numFmt w:val="lowerLetter"/>
+      <w:lvlText w:val="%8."/>
+      <w:lvlJc w:val="left"/>
+      <w:pPr>
+        <w:ind w:left="5760" w:hanging="360"/>
+      </w:pPr>
+    </w:lvl>
+    <w:lvl w:ilvl="8" w:tplc="FFFFFFFF" w:tentative="1">
+      <w:start w:val="1"/>
+      <w:numFmt w:val="lowerRoman"/>
+      <w:lvlText w:val="%9."/>
+      <w:lvlJc w:val="right"/>
+      <w:pPr>
+        <w:ind w:left="6480" w:hanging="180"/>
+      </w:pPr>
+    </w:lvl>
+  </w:abstractNum>
+  <w:abstractNum w:abstractNumId="1" w15:restartNumberingAfterBreak="0">
     <w:nsid w:val="1E682629"/>
     <w:multiLevelType w:val="hybridMultilevel"/>
     <w:tmpl w:val="E990D220"/>
@@ -1066,7 +1880,7 @@
       </w:pPr>
     </w:lvl>
   </w:abstractNum>
-  <w:abstractNum w:abstractNumId="1" w15:restartNumberingAfterBreak="0">
+  <w:abstractNum w:abstractNumId="2" w15:restartNumberingAfterBreak="0">
     <w:nsid w:val="1F4D11CC"/>
     <w:multiLevelType w:val="hybridMultilevel"/>
     <w:tmpl w:val="484E4436"/>
@@ -1152,7 +1966,7 @@
       </w:pPr>
     </w:lvl>
   </w:abstractNum>
-  <w:abstractNum w:abstractNumId="2" w15:restartNumberingAfterBreak="0">
+  <w:abstractNum w:abstractNumId="3" w15:restartNumberingAfterBreak="0">
     <w:nsid w:val="22B828E5"/>
     <w:multiLevelType w:val="hybridMultilevel"/>
     <w:tmpl w:val="20B06724"/>
@@ -1238,7 +2052,7 @@
       </w:pPr>
     </w:lvl>
   </w:abstractNum>
-  <w:abstractNum w:abstractNumId="3" w15:restartNumberingAfterBreak="0">
+  <w:abstractNum w:abstractNumId="4" w15:restartNumberingAfterBreak="0">
     <w:nsid w:val="24976F61"/>
     <w:multiLevelType w:val="hybridMultilevel"/>
     <w:tmpl w:val="4664FA0A"/>
@@ -1324,7 +2138,7 @@
       </w:pPr>
     </w:lvl>
   </w:abstractNum>
-  <w:abstractNum w:abstractNumId="4" w15:restartNumberingAfterBreak="0">
+  <w:abstractNum w:abstractNumId="5" w15:restartNumberingAfterBreak="0">
     <w:nsid w:val="335A47FF"/>
     <w:multiLevelType w:val="hybridMultilevel"/>
     <w:tmpl w:val="C9FEB076"/>
@@ -1410,7 +2224,7 @@
       </w:pPr>
     </w:lvl>
   </w:abstractNum>
-  <w:abstractNum w:abstractNumId="5" w15:restartNumberingAfterBreak="0">
+  <w:abstractNum w:abstractNumId="6" w15:restartNumberingAfterBreak="0">
     <w:nsid w:val="38224148"/>
     <w:multiLevelType w:val="hybridMultilevel"/>
     <w:tmpl w:val="5E2642E6"/>
@@ -1496,7 +2310,265 @@
       </w:pPr>
     </w:lvl>
   </w:abstractNum>
-  <w:abstractNum w:abstractNumId="6" w15:restartNumberingAfterBreak="0">
+  <w:abstractNum w:abstractNumId="7" w15:restartNumberingAfterBreak="0">
+    <w:nsid w:val="49FB71C7"/>
+    <w:multiLevelType w:val="hybridMultilevel"/>
+    <w:tmpl w:val="6CEC299A"/>
+    <w:lvl w:ilvl="0" w:tplc="FFFFFFFF">
+      <w:start w:val="1"/>
+      <w:numFmt w:val="decimal"/>
+      <w:lvlText w:val="%1."/>
+      <w:lvlJc w:val="left"/>
+      <w:pPr>
+        <w:ind w:left="720" w:hanging="360"/>
+      </w:pPr>
+    </w:lvl>
+    <w:lvl w:ilvl="1" w:tplc="08090019" w:tentative="1">
+      <w:start w:val="1"/>
+      <w:numFmt w:val="lowerLetter"/>
+      <w:lvlText w:val="%2."/>
+      <w:lvlJc w:val="left"/>
+      <w:pPr>
+        <w:ind w:left="1440" w:hanging="360"/>
+      </w:pPr>
+    </w:lvl>
+    <w:lvl w:ilvl="2" w:tplc="0809001B" w:tentative="1">
+      <w:start w:val="1"/>
+      <w:numFmt w:val="lowerRoman"/>
+      <w:lvlText w:val="%3."/>
+      <w:lvlJc w:val="right"/>
+      <w:pPr>
+        <w:ind w:left="2160" w:hanging="180"/>
+      </w:pPr>
+    </w:lvl>
+    <w:lvl w:ilvl="3" w:tplc="0809000F" w:tentative="1">
+      <w:start w:val="1"/>
+      <w:numFmt w:val="decimal"/>
+      <w:lvlText w:val="%4."/>
+      <w:lvlJc w:val="left"/>
+      <w:pPr>
+        <w:ind w:left="2880" w:hanging="360"/>
+      </w:pPr>
+    </w:lvl>
+    <w:lvl w:ilvl="4" w:tplc="08090019" w:tentative="1">
+      <w:start w:val="1"/>
+      <w:numFmt w:val="lowerLetter"/>
+      <w:lvlText w:val="%5."/>
+      <w:lvlJc w:val="left"/>
+      <w:pPr>
+        <w:ind w:left="3600" w:hanging="360"/>
+      </w:pPr>
+    </w:lvl>
+    <w:lvl w:ilvl="5" w:tplc="0809001B" w:tentative="1">
+      <w:start w:val="1"/>
+      <w:numFmt w:val="lowerRoman"/>
+      <w:lvlText w:val="%6."/>
+      <w:lvlJc w:val="right"/>
+      <w:pPr>
+        <w:ind w:left="4320" w:hanging="180"/>
+      </w:pPr>
+    </w:lvl>
+    <w:lvl w:ilvl="6" w:tplc="0809000F" w:tentative="1">
+      <w:start w:val="1"/>
+      <w:numFmt w:val="decimal"/>
+      <w:lvlText w:val="%7."/>
+      <w:lvlJc w:val="left"/>
+      <w:pPr>
+        <w:ind w:left="5040" w:hanging="360"/>
+      </w:pPr>
+    </w:lvl>
+    <w:lvl w:ilvl="7" w:tplc="08090019" w:tentative="1">
+      <w:start w:val="1"/>
+      <w:numFmt w:val="lowerLetter"/>
+      <w:lvlText w:val="%8."/>
+      <w:lvlJc w:val="left"/>
+      <w:pPr>
+        <w:ind w:left="5760" w:hanging="360"/>
+      </w:pPr>
+    </w:lvl>
+    <w:lvl w:ilvl="8" w:tplc="0809001B" w:tentative="1">
+      <w:start w:val="1"/>
+      <w:numFmt w:val="lowerRoman"/>
+      <w:lvlText w:val="%9."/>
+      <w:lvlJc w:val="right"/>
+      <w:pPr>
+        <w:ind w:left="6480" w:hanging="180"/>
+      </w:pPr>
+    </w:lvl>
+  </w:abstractNum>
+  <w:abstractNum w:abstractNumId="8" w15:restartNumberingAfterBreak="0">
+    <w:nsid w:val="59D101B0"/>
+    <w:multiLevelType w:val="hybridMultilevel"/>
+    <w:tmpl w:val="66EAA55A"/>
+    <w:lvl w:ilvl="0" w:tplc="08090019">
+      <w:start w:val="1"/>
+      <w:numFmt w:val="lowerLetter"/>
+      <w:lvlText w:val="%1."/>
+      <w:lvlJc w:val="left"/>
+      <w:pPr>
+        <w:ind w:left="720" w:hanging="360"/>
+      </w:pPr>
+    </w:lvl>
+    <w:lvl w:ilvl="1" w:tplc="08090019" w:tentative="1">
+      <w:start w:val="1"/>
+      <w:numFmt w:val="lowerLetter"/>
+      <w:lvlText w:val="%2."/>
+      <w:lvlJc w:val="left"/>
+      <w:pPr>
+        <w:ind w:left="1440" w:hanging="360"/>
+      </w:pPr>
+    </w:lvl>
+    <w:lvl w:ilvl="2" w:tplc="0809001B" w:tentative="1">
+      <w:start w:val="1"/>
+      <w:numFmt w:val="lowerRoman"/>
+      <w:lvlText w:val="%3."/>
+      <w:lvlJc w:val="right"/>
+      <w:pPr>
+        <w:ind w:left="2160" w:hanging="180"/>
+      </w:pPr>
+    </w:lvl>
+    <w:lvl w:ilvl="3" w:tplc="0809000F" w:tentative="1">
+      <w:start w:val="1"/>
+      <w:numFmt w:val="decimal"/>
+      <w:lvlText w:val="%4."/>
+      <w:lvlJc w:val="left"/>
+      <w:pPr>
+        <w:ind w:left="2880" w:hanging="360"/>
+      </w:pPr>
+    </w:lvl>
+    <w:lvl w:ilvl="4" w:tplc="08090019" w:tentative="1">
+      <w:start w:val="1"/>
+      <w:numFmt w:val="lowerLetter"/>
+      <w:lvlText w:val="%5."/>
+      <w:lvlJc w:val="left"/>
+      <w:pPr>
+        <w:ind w:left="3600" w:hanging="360"/>
+      </w:pPr>
+    </w:lvl>
+    <w:lvl w:ilvl="5" w:tplc="0809001B" w:tentative="1">
+      <w:start w:val="1"/>
+      <w:numFmt w:val="lowerRoman"/>
+      <w:lvlText w:val="%6."/>
+      <w:lvlJc w:val="right"/>
+      <w:pPr>
+        <w:ind w:left="4320" w:hanging="180"/>
+      </w:pPr>
+    </w:lvl>
+    <w:lvl w:ilvl="6" w:tplc="0809000F" w:tentative="1">
+      <w:start w:val="1"/>
+      <w:numFmt w:val="decimal"/>
+      <w:lvlText w:val="%7."/>
+      <w:lvlJc w:val="left"/>
+      <w:pPr>
+        <w:ind w:left="5040" w:hanging="360"/>
+      </w:pPr>
+    </w:lvl>
+    <w:lvl w:ilvl="7" w:tplc="08090019" w:tentative="1">
+      <w:start w:val="1"/>
+      <w:numFmt w:val="lowerLetter"/>
+      <w:lvlText w:val="%8."/>
+      <w:lvlJc w:val="left"/>
+      <w:pPr>
+        <w:ind w:left="5760" w:hanging="360"/>
+      </w:pPr>
+    </w:lvl>
+    <w:lvl w:ilvl="8" w:tplc="0809001B" w:tentative="1">
+      <w:start w:val="1"/>
+      <w:numFmt w:val="lowerRoman"/>
+      <w:lvlText w:val="%9."/>
+      <w:lvlJc w:val="right"/>
+      <w:pPr>
+        <w:ind w:left="6480" w:hanging="180"/>
+      </w:pPr>
+    </w:lvl>
+  </w:abstractNum>
+  <w:abstractNum w:abstractNumId="9" w15:restartNumberingAfterBreak="0">
+    <w:nsid w:val="5ABD49FB"/>
+    <w:multiLevelType w:val="hybridMultilevel"/>
+    <w:tmpl w:val="C9FEB076"/>
+    <w:lvl w:ilvl="0" w:tplc="FFFFFFFF">
+      <w:start w:val="1"/>
+      <w:numFmt w:val="decimal"/>
+      <w:lvlText w:val="%1."/>
+      <w:lvlJc w:val="left"/>
+      <w:pPr>
+        <w:ind w:left="720" w:hanging="360"/>
+      </w:pPr>
+    </w:lvl>
+    <w:lvl w:ilvl="1" w:tplc="FFFFFFFF" w:tentative="1">
+      <w:start w:val="1"/>
+      <w:numFmt w:val="lowerLetter"/>
+      <w:lvlText w:val="%2."/>
+      <w:lvlJc w:val="left"/>
+      <w:pPr>
+        <w:ind w:left="1440" w:hanging="360"/>
+      </w:pPr>
+    </w:lvl>
+    <w:lvl w:ilvl="2" w:tplc="FFFFFFFF" w:tentative="1">
+      <w:start w:val="1"/>
+      <w:numFmt w:val="lowerRoman"/>
+      <w:lvlText w:val="%3."/>
+      <w:lvlJc w:val="right"/>
+      <w:pPr>
+        <w:ind w:left="2160" w:hanging="180"/>
+      </w:pPr>
+    </w:lvl>
+    <w:lvl w:ilvl="3" w:tplc="FFFFFFFF" w:tentative="1">
+      <w:start w:val="1"/>
+      <w:numFmt w:val="decimal"/>
+      <w:lvlText w:val="%4."/>
+      <w:lvlJc w:val="left"/>
+      <w:pPr>
+        <w:ind w:left="2880" w:hanging="360"/>
+      </w:pPr>
+    </w:lvl>
+    <w:lvl w:ilvl="4" w:tplc="FFFFFFFF" w:tentative="1">
+      <w:start w:val="1"/>
+      <w:numFmt w:val="lowerLetter"/>
+      <w:lvlText w:val="%5."/>
+      <w:lvlJc w:val="left"/>
+      <w:pPr>
+        <w:ind w:left="3600" w:hanging="360"/>
+      </w:pPr>
+    </w:lvl>
+    <w:lvl w:ilvl="5" w:tplc="FFFFFFFF" w:tentative="1">
+      <w:start w:val="1"/>
+      <w:numFmt w:val="lowerRoman"/>
+      <w:lvlText w:val="%6."/>
+      <w:lvlJc w:val="right"/>
+      <w:pPr>
+        <w:ind w:left="4320" w:hanging="180"/>
+      </w:pPr>
+    </w:lvl>
+    <w:lvl w:ilvl="6" w:tplc="FFFFFFFF" w:tentative="1">
+      <w:start w:val="1"/>
+      <w:numFmt w:val="decimal"/>
+      <w:lvlText w:val="%7."/>
+      <w:lvlJc w:val="left"/>
+      <w:pPr>
+        <w:ind w:left="5040" w:hanging="360"/>
+      </w:pPr>
+    </w:lvl>
+    <w:lvl w:ilvl="7" w:tplc="FFFFFFFF" w:tentative="1">
+      <w:start w:val="1"/>
+      <w:numFmt w:val="lowerLetter"/>
+      <w:lvlText w:val="%8."/>
+      <w:lvlJc w:val="left"/>
+      <w:pPr>
+        <w:ind w:left="5760" w:hanging="360"/>
+      </w:pPr>
+    </w:lvl>
+    <w:lvl w:ilvl="8" w:tplc="FFFFFFFF" w:tentative="1">
+      <w:start w:val="1"/>
+      <w:numFmt w:val="lowerRoman"/>
+      <w:lvlText w:val="%9."/>
+      <w:lvlJc w:val="right"/>
+      <w:pPr>
+        <w:ind w:left="6480" w:hanging="180"/>
+      </w:pPr>
+    </w:lvl>
+  </w:abstractNum>
+  <w:abstractNum w:abstractNumId="10" w15:restartNumberingAfterBreak="0">
     <w:nsid w:val="60A26EA6"/>
     <w:multiLevelType w:val="hybridMultilevel"/>
     <w:tmpl w:val="6C161DB2"/>
@@ -1582,7 +2654,7 @@
       </w:pPr>
     </w:lvl>
   </w:abstractNum>
-  <w:abstractNum w:abstractNumId="7" w15:restartNumberingAfterBreak="0">
+  <w:abstractNum w:abstractNumId="11" w15:restartNumberingAfterBreak="0">
     <w:nsid w:val="68AF4DD5"/>
     <w:multiLevelType w:val="hybridMultilevel"/>
     <w:tmpl w:val="606ED966"/>
@@ -1668,17 +2740,103 @@
       </w:pPr>
     </w:lvl>
   </w:abstractNum>
+  <w:abstractNum w:abstractNumId="12" w15:restartNumberingAfterBreak="0">
+    <w:nsid w:val="6C781266"/>
+    <w:multiLevelType w:val="hybridMultilevel"/>
+    <w:tmpl w:val="C9FEB076"/>
+    <w:lvl w:ilvl="0" w:tplc="FFFFFFFF">
+      <w:start w:val="1"/>
+      <w:numFmt w:val="decimal"/>
+      <w:lvlText w:val="%1."/>
+      <w:lvlJc w:val="left"/>
+      <w:pPr>
+        <w:ind w:left="720" w:hanging="360"/>
+      </w:pPr>
+    </w:lvl>
+    <w:lvl w:ilvl="1" w:tplc="FFFFFFFF" w:tentative="1">
+      <w:start w:val="1"/>
+      <w:numFmt w:val="lowerLetter"/>
+      <w:lvlText w:val="%2."/>
+      <w:lvlJc w:val="left"/>
+      <w:pPr>
+        <w:ind w:left="1440" w:hanging="360"/>
+      </w:pPr>
+    </w:lvl>
+    <w:lvl w:ilvl="2" w:tplc="FFFFFFFF" w:tentative="1">
+      <w:start w:val="1"/>
+      <w:numFmt w:val="lowerRoman"/>
+      <w:lvlText w:val="%3."/>
+      <w:lvlJc w:val="right"/>
+      <w:pPr>
+        <w:ind w:left="2160" w:hanging="180"/>
+      </w:pPr>
+    </w:lvl>
+    <w:lvl w:ilvl="3" w:tplc="FFFFFFFF" w:tentative="1">
+      <w:start w:val="1"/>
+      <w:numFmt w:val="decimal"/>
+      <w:lvlText w:val="%4."/>
+      <w:lvlJc w:val="left"/>
+      <w:pPr>
+        <w:ind w:left="2880" w:hanging="360"/>
+      </w:pPr>
+    </w:lvl>
+    <w:lvl w:ilvl="4" w:tplc="FFFFFFFF" w:tentative="1">
+      <w:start w:val="1"/>
+      <w:numFmt w:val="lowerLetter"/>
+      <w:lvlText w:val="%5."/>
+      <w:lvlJc w:val="left"/>
+      <w:pPr>
+        <w:ind w:left="3600" w:hanging="360"/>
+      </w:pPr>
+    </w:lvl>
+    <w:lvl w:ilvl="5" w:tplc="FFFFFFFF" w:tentative="1">
+      <w:start w:val="1"/>
+      <w:numFmt w:val="lowerRoman"/>
+      <w:lvlText w:val="%6."/>
+      <w:lvlJc w:val="right"/>
+      <w:pPr>
+        <w:ind w:left="4320" w:hanging="180"/>
+      </w:pPr>
+    </w:lvl>
+    <w:lvl w:ilvl="6" w:tplc="FFFFFFFF" w:tentative="1">
+      <w:start w:val="1"/>
+      <w:numFmt w:val="decimal"/>
+      <w:lvlText w:val="%7."/>
+      <w:lvlJc w:val="left"/>
+      <w:pPr>
+        <w:ind w:left="5040" w:hanging="360"/>
+      </w:pPr>
+    </w:lvl>
+    <w:lvl w:ilvl="7" w:tplc="FFFFFFFF" w:tentative="1">
+      <w:start w:val="1"/>
+      <w:numFmt w:val="lowerLetter"/>
+      <w:lvlText w:val="%8."/>
+      <w:lvlJc w:val="left"/>
+      <w:pPr>
+        <w:ind w:left="5760" w:hanging="360"/>
+      </w:pPr>
+    </w:lvl>
+    <w:lvl w:ilvl="8" w:tplc="FFFFFFFF" w:tentative="1">
+      <w:start w:val="1"/>
+      <w:numFmt w:val="lowerRoman"/>
+      <w:lvlText w:val="%9."/>
+      <w:lvlJc w:val="right"/>
+      <w:pPr>
+        <w:ind w:left="6480" w:hanging="180"/>
+      </w:pPr>
+    </w:lvl>
+  </w:abstractNum>
   <w:num w:numId="1" w16cid:durableId="1727414069">
-    <w:abstractNumId w:val="3"/>
+    <w:abstractNumId w:val="4"/>
   </w:num>
   <w:num w:numId="2" w16cid:durableId="441458316">
-    <w:abstractNumId w:val="1"/>
+    <w:abstractNumId w:val="2"/>
   </w:num>
   <w:num w:numId="3" w16cid:durableId="122045343">
-    <w:abstractNumId w:val="6"/>
+    <w:abstractNumId w:val="10"/>
   </w:num>
   <w:num w:numId="4" w16cid:durableId="740370251">
-    <w:abstractNumId w:val="3"/>
+    <w:abstractNumId w:val="4"/>
     <w:lvlOverride w:ilvl="0">
       <w:startOverride w:val="1"/>
     </w:lvlOverride>
@@ -1708,7 +2866,7 @@
     </w:lvlOverride>
   </w:num>
   <w:num w:numId="5" w16cid:durableId="29645142">
-    <w:abstractNumId w:val="1"/>
+    <w:abstractNumId w:val="2"/>
     <w:lvlOverride w:ilvl="0">
       <w:startOverride w:val="1"/>
     </w:lvlOverride>
@@ -1738,19 +2896,94 @@
     </w:lvlOverride>
   </w:num>
   <w:num w:numId="6" w16cid:durableId="235021382">
+    <w:abstractNumId w:val="6"/>
+  </w:num>
+  <w:num w:numId="7" w16cid:durableId="1588613789">
+    <w:abstractNumId w:val="3"/>
+  </w:num>
+  <w:num w:numId="8" w16cid:durableId="33309758">
     <w:abstractNumId w:val="5"/>
   </w:num>
-  <w:num w:numId="7" w16cid:durableId="1588613789">
-    <w:abstractNumId w:val="2"/>
-  </w:num>
-  <w:num w:numId="8" w16cid:durableId="33309758">
-    <w:abstractNumId w:val="4"/>
-  </w:num>
   <w:num w:numId="9" w16cid:durableId="822158530">
-    <w:abstractNumId w:val="7"/>
+    <w:abstractNumId w:val="11"/>
   </w:num>
   <w:num w:numId="10" w16cid:durableId="1753116639">
+    <w:abstractNumId w:val="1"/>
+  </w:num>
+  <w:num w:numId="11" w16cid:durableId="130482559">
+    <w:abstractNumId w:val="12"/>
+  </w:num>
+  <w:num w:numId="12" w16cid:durableId="1543858118">
+    <w:abstractNumId w:val="8"/>
+  </w:num>
+  <w:num w:numId="13" w16cid:durableId="1631667582">
+    <w:abstractNumId w:val="9"/>
+  </w:num>
+  <w:num w:numId="14" w16cid:durableId="439842046">
     <w:abstractNumId w:val="0"/>
+  </w:num>
+  <w:num w:numId="15" w16cid:durableId="929657568">
+    <w:abstractNumId w:val="5"/>
+    <w:lvlOverride w:ilvl="0">
+      <w:startOverride w:val="1"/>
+    </w:lvlOverride>
+    <w:lvlOverride w:ilvl="1">
+      <w:startOverride w:val="1"/>
+    </w:lvlOverride>
+    <w:lvlOverride w:ilvl="2">
+      <w:startOverride w:val="1"/>
+    </w:lvlOverride>
+    <w:lvlOverride w:ilvl="3">
+      <w:startOverride w:val="1"/>
+    </w:lvlOverride>
+    <w:lvlOverride w:ilvl="4">
+      <w:startOverride w:val="1"/>
+    </w:lvlOverride>
+    <w:lvlOverride w:ilvl="5">
+      <w:startOverride w:val="1"/>
+    </w:lvlOverride>
+    <w:lvlOverride w:ilvl="6">
+      <w:startOverride w:val="1"/>
+    </w:lvlOverride>
+    <w:lvlOverride w:ilvl="7">
+      <w:startOverride w:val="1"/>
+    </w:lvlOverride>
+    <w:lvlOverride w:ilvl="8">
+      <w:startOverride w:val="1"/>
+    </w:lvlOverride>
+  </w:num>
+  <w:num w:numId="16" w16cid:durableId="1120027946">
+    <w:abstractNumId w:val="9"/>
+    <w:lvlOverride w:ilvl="0">
+      <w:startOverride w:val="1"/>
+    </w:lvlOverride>
+    <w:lvlOverride w:ilvl="1">
+      <w:startOverride w:val="1"/>
+    </w:lvlOverride>
+    <w:lvlOverride w:ilvl="2">
+      <w:startOverride w:val="1"/>
+    </w:lvlOverride>
+    <w:lvlOverride w:ilvl="3">
+      <w:startOverride w:val="1"/>
+    </w:lvlOverride>
+    <w:lvlOverride w:ilvl="4">
+      <w:startOverride w:val="1"/>
+    </w:lvlOverride>
+    <w:lvlOverride w:ilvl="5">
+      <w:startOverride w:val="1"/>
+    </w:lvlOverride>
+    <w:lvlOverride w:ilvl="6">
+      <w:startOverride w:val="1"/>
+    </w:lvlOverride>
+    <w:lvlOverride w:ilvl="7">
+      <w:startOverride w:val="1"/>
+    </w:lvlOverride>
+    <w:lvlOverride w:ilvl="8">
+      <w:startOverride w:val="1"/>
+    </w:lvlOverride>
+  </w:num>
+  <w:num w:numId="17" w16cid:durableId="1898779854">
+    <w:abstractNumId w:val="7"/>
   </w:num>
 </w:numbering>
 </file>
@@ -2155,7 +3388,7 @@
   <w:style w:type="paragraph" w:default="1" w:styleId="Normal">
     <w:name w:val="Normal"/>
     <w:qFormat/>
-    <w:rsid w:val="004A3C2B"/>
+    <w:rsid w:val="00563CD5"/>
     <w:rPr>
       <w:lang w:val="cs-CZ"/>
     </w:rPr>
@@ -2361,7 +3594,6 @@
   <w:style w:type="character" w:default="1" w:styleId="DefaultParagraphFont">
     <w:name w:val="Default Paragraph Font"/>
     <w:uiPriority w:val="1"/>
-    <w:semiHidden/>
     <w:unhideWhenUsed/>
   </w:style>
   <w:style w:type="table" w:default="1" w:styleId="TableNormal">

</xml_diff>